<commit_message>
Fixed typos in tables, and changed_c to _i in equations.
</commit_message>
<xml_diff>
--- a/PAPER/Draft/paper_final_draft.docx
+++ b/PAPER/Draft/paper_final_draft.docx
@@ -1,13 +1,13 @@
 
 <file path=word/document.xml><?xml version="1.0" encoding="utf-8"?>
-<w:document xmlns:wpc="http://schemas.microsoft.com/office/word/2010/wordprocessingCanvas" xmlns:cx="http://schemas.microsoft.com/office/drawing/2014/chartex" xmlns:cx1="http://schemas.microsoft.com/office/drawing/2015/9/8/chartex" xmlns:cx2="http://schemas.microsoft.com/office/drawing/2015/10/21/chartex" xmlns:cx3="http://schemas.microsoft.com/office/drawing/2016/5/9/chartex" xmlns:cx4="http://schemas.microsoft.com/office/drawing/2016/5/10/chartex" xmlns:cx5="http://schemas.microsoft.com/office/drawing/2016/5/11/chartex" xmlns:cx6="http://schemas.microsoft.com/office/drawing/2016/5/12/chartex" xmlns:cx7="http://schemas.microsoft.com/office/drawing/2016/5/13/chartex" xmlns:cx8="http://schemas.microsoft.com/office/drawing/2016/5/14/chartex" xmlns:mc="http://schemas.openxmlformats.org/markup-compatibility/2006" xmlns:aink="http://schemas.microsoft.com/office/drawing/2016/ink" xmlns:am3d="http://schemas.microsoft.com/office/drawing/2017/model3d" xmlns:o="urn:schemas-microsoft-com:office:office" xmlns:oel="http://schemas.microsoft.com/office/2019/extlst" xmlns:r="http://schemas.openxmlformats.org/officeDocument/2006/relationships" xmlns:m="http://schemas.openxmlformats.org/officeDocument/2006/math" xmlns:v="urn:schemas-microsoft-com:vml" xmlns:wp14="http://schemas.microsoft.com/office/word/2010/wordprocessingDrawing" xmlns:wp="http://schemas.openxmlformats.org/drawingml/2006/wordprocessingDrawing" xmlns:w10="urn:schemas-microsoft-com:office:word" xmlns:w="http://schemas.openxmlformats.org/wordprocessingml/2006/main" xmlns:w14="http://schemas.microsoft.com/office/word/2010/wordml" xmlns:w15="http://schemas.microsoft.com/office/word/2012/wordml" xmlns:w16cex="http://schemas.microsoft.com/office/word/2018/wordml/cex" xmlns:w16cid="http://schemas.microsoft.com/office/word/2016/wordml/cid" xmlns:w16="http://schemas.microsoft.com/office/word/2018/wordml" xmlns:w16du="http://schemas.microsoft.com/office/word/2023/wordml/word16du" xmlns:w16sdtdh="http://schemas.microsoft.com/office/word/2020/wordml/sdtdatahash" xmlns:w16sdtfl="http://schemas.microsoft.com/office/word/2024/wordml/sdtformatlock" xmlns:w16se="http://schemas.microsoft.com/office/word/2015/wordml/symex" xmlns:wpg="http://schemas.microsoft.com/office/word/2010/wordprocessingGroup" xmlns:wpi="http://schemas.microsoft.com/office/word/2010/wordprocessingInk" xmlns:wne="http://schemas.microsoft.com/office/word/2006/wordml" xmlns:wps="http://schemas.microsoft.com/office/word/2010/wordprocessingShape" mc:Ignorable="w14 w15 w16se w16cid w16 w16cex w16sdtdh w16sdtfl w16du wp14">
+<w:document xmlns:wpc="http://schemas.microsoft.com/office/word/2010/wordprocessingCanvas" xmlns:cx="http://schemas.microsoft.com/office/drawing/2014/chartex" xmlns:cx1="http://schemas.microsoft.com/office/drawing/2015/9/8/chartex" xmlns:cx2="http://schemas.microsoft.com/office/drawing/2015/10/21/chartex" xmlns:cx3="http://schemas.microsoft.com/office/drawing/2016/5/9/chartex" xmlns:cx4="http://schemas.microsoft.com/office/drawing/2016/5/10/chartex" xmlns:cx5="http://schemas.microsoft.com/office/drawing/2016/5/11/chartex" xmlns:cx6="http://schemas.microsoft.com/office/drawing/2016/5/12/chartex" xmlns:cx7="http://schemas.microsoft.com/office/drawing/2016/5/13/chartex" xmlns:cx8="http://schemas.microsoft.com/office/drawing/2016/5/14/chartex" xmlns:mc="http://schemas.openxmlformats.org/markup-compatibility/2006" xmlns:aink="http://schemas.microsoft.com/office/drawing/2016/ink" xmlns:am3d="http://schemas.microsoft.com/office/drawing/2017/model3d" xmlns:o="urn:schemas-microsoft-com:office:office" xmlns:oel="http://schemas.microsoft.com/office/2019/extlst" xmlns:r="http://schemas.openxmlformats.org/officeDocument/2006/relationships" xmlns:m="http://schemas.openxmlformats.org/officeDocument/2006/math" xmlns:v="urn:schemas-microsoft-com:vml" xmlns:wp14="http://schemas.microsoft.com/office/word/2010/wordprocessingDrawing" xmlns:wp="http://schemas.openxmlformats.org/drawingml/2006/wordprocessingDrawing" xmlns:w10="urn:schemas-microsoft-com:office:word" xmlns:w="http://schemas.openxmlformats.org/wordprocessingml/2006/main" xmlns:w14="http://schemas.microsoft.com/office/word/2010/wordml" xmlns:w15="http://schemas.microsoft.com/office/word/2012/wordml" xmlns:w16cex="http://schemas.microsoft.com/office/word/2018/wordml/cex" xmlns:w16cid="http://schemas.microsoft.com/office/word/2016/wordml/cid" xmlns:w16="http://schemas.microsoft.com/office/word/2018/wordml" xmlns:w16du="http://schemas.microsoft.com/office/word/2023/wordml/word16du" xmlns:w16sdtdh="http://schemas.microsoft.com/office/word/2020/wordml/sdtdatahash" xmlns:w16sdtfl="http://schemas.microsoft.com/office/word/2024/wordml/sdtformatlock" xmlns:w16se="http://schemas.microsoft.com/office/word/2015/wordml/symex" xmlns:wpg="http://schemas.microsoft.com/office/word/2010/wordprocessingGroup" xmlns:wpi="http://schemas.microsoft.com/office/word/2010/wordprocessingInk" xmlns:wne="http://schemas.microsoft.com/office/word/2006/wordml" xmlns:wps="http://schemas.microsoft.com/office/word/2010/wordprocessingShape" xmlns:a="http://schemas.openxmlformats.org/drawingml/2006/main" xmlns:pic="http://schemas.openxmlformats.org/drawingml/2006/picture" xmlns:a14="http://schemas.microsoft.com/office/drawing/2010/main" mc:Ignorable="w14 w15 w16se w16cid w16 w16cex w16sdtdh w16sdtfl w16du wp14">
   <w:body>
     <w:p>
       <w:pPr>
         <w:pStyle w:val="Heading1"/>
         <w:jc w:val="both"/>
       </w:pPr>
-      <w:bookmarkStart w:id="0" w:name="Xf61781707d53010358bb1a4bcdffc1b05c27b12"/>
+      <w:bookmarkStart w:name="Xf61781707d53010358bb1a4bcdffc1b05c27b12" w:id="0"/>
       <w:r>
         <w:t>Does Regional Integration Divert Trade from Europe? A Ratio-Regressor Critique of EU–ACP Gravity Estimates</w:t>
       </w:r>
@@ -17,7 +17,7 @@
         <w:pStyle w:val="Heading2"/>
         <w:jc w:val="both"/>
       </w:pPr>
-      <w:bookmarkStart w:id="1" w:name="abstract"/>
+      <w:bookmarkStart w:name="abstract" w:id="1"/>
       <w:r>
         <w:t>Abstract</w:t>
       </w:r>
@@ -36,7 +36,7 @@
         <w:pStyle w:val="Heading2"/>
         <w:jc w:val="both"/>
       </w:pPr>
-      <w:bookmarkStart w:id="2" w:name="introduction"/>
+      <w:bookmarkStart w:name="introduction" w:id="2"/>
       <w:bookmarkEnd w:id="1"/>
       <w:r>
         <w:t>1. Introduction</w:t>
@@ -101,7 +101,7 @@
         <w:pStyle w:val="Heading2"/>
         <w:jc w:val="both"/>
       </w:pPr>
-      <w:bookmarkStart w:id="3" w:name="institutional-background"/>
+      <w:bookmarkStart w:name="institutional-background" w:id="3"/>
       <w:bookmarkEnd w:id="2"/>
       <w:r>
         <w:t>2. Institutional Background</w:t>
@@ -112,7 +112,7 @@
         <w:pStyle w:val="Heading3"/>
         <w:jc w:val="both"/>
       </w:pPr>
-      <w:bookmarkStart w:id="4" w:name="the-cotonou-partnership-agreement"/>
+      <w:bookmarkStart w:name="the-cotonou-partnership-agreement" w:id="4"/>
       <w:r>
         <w:t>The Cotonou Partnership Agreement</w:t>
       </w:r>
@@ -140,7 +140,7 @@
         <w:pStyle w:val="Heading3"/>
         <w:jc w:val="both"/>
       </w:pPr>
-      <w:bookmarkStart w:id="5" w:name="acp-regional-groupings-and-epa-status"/>
+      <w:bookmarkStart w:name="acp-regional-groupings-and-epa-status" w:id="5"/>
       <w:bookmarkEnd w:id="4"/>
       <w:r>
         <w:t>ACP Regional Groupings and EPA Status</w:t>
@@ -753,7 +753,7 @@
         <w:pStyle w:val="Heading2"/>
         <w:jc w:val="both"/>
       </w:pPr>
-      <w:bookmarkStart w:id="6" w:name="literature-review"/>
+      <w:bookmarkStart w:name="literature-review" w:id="6"/>
       <w:bookmarkEnd w:id="3"/>
       <w:bookmarkEnd w:id="5"/>
       <w:r>
@@ -774,7 +774,7 @@
         <w:pStyle w:val="Heading3"/>
         <w:jc w:val="both"/>
       </w:pPr>
-      <w:bookmarkStart w:id="7" w:name="building-blocks-or-stumbling-blocks"/>
+      <w:bookmarkStart w:name="building-blocks-or-stumbling-blocks" w:id="7"/>
       <w:r>
         <w:t>Building Blocks or Stumbling Blocks?</w:t>
       </w:r>
@@ -820,7 +820,7 @@
         <w:pStyle w:val="Heading3"/>
         <w:jc w:val="both"/>
       </w:pPr>
-      <w:bookmarkStart w:id="8" w:name="acp-trade-and-epa-studies"/>
+      <w:bookmarkStart w:name="acp-trade-and-epa-studies" w:id="8"/>
       <w:bookmarkEnd w:id="7"/>
       <w:r>
         <w:t>ACP Trade and EPA Studies</w:t>
@@ -861,7 +861,7 @@
         <w:pStyle w:val="Heading2"/>
         <w:jc w:val="both"/>
       </w:pPr>
-      <w:bookmarkStart w:id="9" w:name="data-and-methodology"/>
+      <w:bookmarkStart w:name="data-and-methodology" w:id="9"/>
       <w:bookmarkEnd w:id="6"/>
       <w:bookmarkEnd w:id="8"/>
       <w:r>
@@ -873,7 +873,7 @@
         <w:pStyle w:val="Heading3"/>
         <w:jc w:val="both"/>
       </w:pPr>
-      <w:bookmarkStart w:id="10" w:name="data-sources-and-panel-construction"/>
+      <w:bookmarkStart w:name="data-sources-and-panel-construction" w:id="10"/>
       <w:r>
         <w:t xml:space="preserve">4.1 </w:t>
       </w:r>
@@ -928,7 +928,7 @@
         <w:pStyle w:val="Heading3"/>
         <w:jc w:val="both"/>
       </w:pPr>
-      <w:bookmarkStart w:id="11" w:name="key-variables"/>
+      <w:bookmarkStart w:name="key-variables" w:id="11"/>
       <w:bookmarkEnd w:id="10"/>
       <w:r>
         <w:t xml:space="preserve">4.2 </w:t>
@@ -978,7 +978,7 @@
         <w:pStyle w:val="Heading3"/>
         <w:jc w:val="both"/>
       </w:pPr>
-      <w:bookmarkStart w:id="12" w:name="gravity-specification"/>
+      <w:bookmarkStart w:name="gravity-specification" w:id="12"/>
       <w:bookmarkEnd w:id="11"/>
       <w:r>
         <w:t>Gravity Specification</w:t>
@@ -997,47 +997,315 @@
       <w:pPr>
         <w:spacing w:before="180" w:after="180"/>
         <w:jc w:val="both"/>
-      </w:pPr>
-      <w:r>
         <w:rPr>
-          <w:rFonts w:ascii="Times New Roman" w:eastAsia="Times New Roman" w:hAnsi="Times New Roman" w:cs="Times New Roman"/>
-          <w:i/>
-          <w:iCs/>
-          <w:color w:val="000000" w:themeColor="text1"/>
+          <w:rFonts w:ascii="Times New Roman" w:hAnsi="Times New Roman" w:eastAsia="Times New Roman" w:cs="Times New Roman"/>
+          <w:color w:val="000000" w:themeColor="text1" w:themeTint="FF" w:themeShade="FF"/>
           <w:sz w:val="22"/>
           <w:szCs w:val="22"/>
         </w:rPr>
-        <w:t>Xijt</w:t>
-      </w:r>
-      <w:r>
-        <w:rPr>
-          <w:rFonts w:ascii="Times New Roman" w:eastAsia="Times New Roman" w:hAnsi="Times New Roman" w:cs="Times New Roman"/>
-          <w:color w:val="000000" w:themeColor="text1"/>
-          <w:sz w:val="22"/>
-          <w:szCs w:val="22"/>
-        </w:rPr>
-        <w:t xml:space="preserve"> = exp(β1 ln </w:t>
-      </w:r>
-      <w:r>
-        <w:rPr>
-          <w:rFonts w:ascii="Times New Roman" w:eastAsia="Times New Roman" w:hAnsi="Times New Roman" w:cs="Times New Roman"/>
-          <w:i/>
-          <w:iCs/>
-          <w:color w:val="000000" w:themeColor="text1"/>
-          <w:sz w:val="22"/>
-          <w:szCs w:val="22"/>
-        </w:rPr>
-        <w:t>dij</w:t>
-      </w:r>
-      <w:r>
-        <w:rPr>
-          <w:rFonts w:ascii="Times New Roman" w:eastAsia="Times New Roman" w:hAnsi="Times New Roman" w:cs="Times New Roman"/>
-          <w:color w:val="000000" w:themeColor="text1"/>
-          <w:sz w:val="22"/>
-          <w:szCs w:val="22"/>
-        </w:rPr>
-        <w:t xml:space="preserve"> + β2 Langij + β3 Colonyij + β4 EPAijt + β5 IT Sharect + μjt + ηi) × εijt</w:t>
-      </w:r>
+      </w:pPr>
+      <m:oMathPara xmlns:m="http://schemas.openxmlformats.org/officeDocument/2006/math">
+        <m:oMath xmlns:m="http://schemas.openxmlformats.org/officeDocument/2006/math">
+          <m:sSub xmlns:m="http://schemas.openxmlformats.org/officeDocument/2006/math">
+            <m:sSubPr>
+              <m:ctrlPr/>
+            </m:sSubPr>
+            <m:e>
+              <m:r>
+                <m:t>𝑋</m:t>
+              </m:r>
+            </m:e>
+            <m:sub>
+              <m:r>
+                <m:t>𝑖𝑗𝑡</m:t>
+              </m:r>
+              <m:r>
+                <m:t> </m:t>
+              </m:r>
+            </m:sub>
+          </m:sSub>
+          <m:r xmlns:m="http://schemas.openxmlformats.org/officeDocument/2006/math">
+            <m:t xmlns:m="http://schemas.openxmlformats.org/officeDocument/2006/math">= </m:t>
+          </m:r>
+          <m:func xmlns:m="http://schemas.openxmlformats.org/officeDocument/2006/math">
+            <m:funcPr>
+              <m:ctrlPr/>
+            </m:funcPr>
+            <m:fName>
+              <m:r>
+                <m:rPr>
+                  <m:sty m:val="p"/>
+                </m:rPr>
+                <m:t>exp</m:t>
+              </m:r>
+            </m:fName>
+            <m:e>
+              <m:d>
+                <m:dPr>
+                  <m:ctrlPr/>
+                </m:dPr>
+                <m:e>
+                  <m:sSub>
+                    <m:sSubPr>
+                      <m:ctrlPr/>
+                    </m:sSubPr>
+                    <m:e>
+                      <m:r>
+                        <m:t>𝛽</m:t>
+                      </m:r>
+                    </m:e>
+                    <m:sub>
+                      <m:r>
+                        <m:t>1</m:t>
+                      </m:r>
+                    </m:sub>
+                  </m:sSub>
+                  <m:func>
+                    <m:funcPr>
+                      <m:ctrlPr/>
+                    </m:funcPr>
+                    <m:fName>
+                      <m:r>
+                        <m:rPr>
+                          <m:sty m:val="p"/>
+                        </m:rPr>
+                        <m:t>ln</m:t>
+                      </m:r>
+                    </m:fName>
+                    <m:e>
+                      <m:sSub>
+                        <m:sSubPr>
+                          <m:ctrlPr/>
+                        </m:sSubPr>
+                        <m:e>
+                          <m:r>
+                            <m:t>𝑑</m:t>
+                          </m:r>
+                        </m:e>
+                        <m:sub>
+                          <m:r>
+                            <m:t>𝑖𝑗</m:t>
+                          </m:r>
+                        </m:sub>
+                      </m:sSub>
+                    </m:e>
+                  </m:func>
+                  <m:r>
+                    <m:t> + </m:t>
+                  </m:r>
+                  <m:sSub>
+                    <m:sSubPr>
+                      <m:ctrlPr/>
+                    </m:sSubPr>
+                    <m:e>
+                      <m:r>
+                        <m:t>𝛽</m:t>
+                      </m:r>
+                    </m:e>
+                    <m:sub>
+                      <m:r>
+                        <m:t>2</m:t>
+                      </m:r>
+                    </m:sub>
+                  </m:sSub>
+                  <m:r>
+                    <m:t>𝐿𝑎𝑛</m:t>
+                  </m:r>
+                  <m:sSub>
+                    <m:sSubPr>
+                      <m:ctrlPr/>
+                    </m:sSubPr>
+                    <m:e>
+                      <m:r>
+                        <m:t>𝑔</m:t>
+                      </m:r>
+                    </m:e>
+                    <m:sub>
+                      <m:r>
+                        <m:t>𝑖𝑗</m:t>
+                      </m:r>
+                    </m:sub>
+                  </m:sSub>
+                  <m:r>
+                    <m:t>+</m:t>
+                  </m:r>
+                  <m:sSub>
+                    <m:sSubPr>
+                      <m:ctrlPr/>
+                    </m:sSubPr>
+                    <m:e>
+                      <m:r>
+                        <m:t>𝛽</m:t>
+                      </m:r>
+                    </m:e>
+                    <m:sub>
+                      <m:r>
+                        <m:t>3</m:t>
+                      </m:r>
+                    </m:sub>
+                  </m:sSub>
+                  <m:r>
+                    <m:t>𝐶𝑜𝑙𝑜𝑛</m:t>
+                  </m:r>
+                  <m:sSub>
+                    <m:sSubPr>
+                      <m:ctrlPr/>
+                    </m:sSubPr>
+                    <m:e>
+                      <m:r>
+                        <m:t>𝑦</m:t>
+                      </m:r>
+                    </m:e>
+                    <m:sub>
+                      <m:r>
+                        <m:t>𝑖𝑗</m:t>
+                      </m:r>
+                    </m:sub>
+                  </m:sSub>
+                  <m:r>
+                    <m:t>+</m:t>
+                  </m:r>
+                  <m:sSub>
+                    <m:sSubPr>
+                      <m:ctrlPr/>
+                    </m:sSubPr>
+                    <m:e>
+                      <m:r>
+                        <m:t>𝛽</m:t>
+                      </m:r>
+                    </m:e>
+                    <m:sub>
+                      <m:r>
+                        <m:t>4</m:t>
+                      </m:r>
+                    </m:sub>
+                  </m:sSub>
+                  <m:r>
+                    <m:t>𝐸𝑃</m:t>
+                  </m:r>
+                  <m:sSub>
+                    <m:sSubPr>
+                      <m:ctrlPr/>
+                    </m:sSubPr>
+                    <m:e>
+                      <m:r>
+                        <m:t>𝐴</m:t>
+                      </m:r>
+                    </m:e>
+                    <m:sub>
+                      <m:r>
+                        <m:t>𝑖𝑗𝑡</m:t>
+                      </m:r>
+                    </m:sub>
+                  </m:sSub>
+                  <m:r>
+                    <m:t>+</m:t>
+                  </m:r>
+                  <m:sSub>
+                    <m:sSubPr>
+                      <m:ctrlPr/>
+                    </m:sSubPr>
+                    <m:e>
+                      <m:r>
+                        <m:t>𝛽</m:t>
+                      </m:r>
+                    </m:e>
+                    <m:sub>
+                      <m:r>
+                        <m:t>5</m:t>
+                      </m:r>
+                    </m:sub>
+                  </m:sSub>
+                  <m:r>
+                    <m:t>𝐼𝑇</m:t>
+                  </m:r>
+                  <m:r>
+                    <m:t> </m:t>
+                  </m:r>
+                  <m:r>
+                    <m:t>𝑆h𝑎𝑟</m:t>
+                  </m:r>
+                  <m:sSub>
+                    <m:sSubPr>
+                      <m:ctrlPr/>
+                    </m:sSubPr>
+                    <m:e>
+                      <m:r>
+                        <m:t>𝑒</m:t>
+                      </m:r>
+                    </m:e>
+                    <m:sub>
+                      <m:r>
+                        <m:t>𝑐𝑡</m:t>
+                      </m:r>
+                    </m:sub>
+                  </m:sSub>
+                  <m:r>
+                    <m:t>+</m:t>
+                  </m:r>
+                  <m:sSub>
+                    <m:sSubPr>
+                      <m:ctrlPr/>
+                    </m:sSubPr>
+                    <m:e>
+                      <m:r>
+                        <m:t>𝜇</m:t>
+                      </m:r>
+                    </m:e>
+                    <m:sub>
+                      <m:r>
+                        <m:t>𝑗𝑡</m:t>
+                      </m:r>
+                    </m:sub>
+                  </m:sSub>
+                  <m:r>
+                    <m:t>+</m:t>
+                  </m:r>
+                  <m:sSub>
+                    <m:sSubPr>
+                      <m:ctrlPr/>
+                    </m:sSubPr>
+                    <m:e>
+                      <m:r>
+                        <m:t>𝜂</m:t>
+                      </m:r>
+                    </m:e>
+                    <m:sub>
+                      <m:r>
+                        <m:t>𝑖</m:t>
+                      </m:r>
+                    </m:sub>
+                  </m:sSub>
+                </m:e>
+              </m:d>
+            </m:e>
+          </m:func>
+          <m:r xmlns:m="http://schemas.openxmlformats.org/officeDocument/2006/math">
+            <m:t xmlns:m="http://schemas.openxmlformats.org/officeDocument/2006/math"> </m:t>
+          </m:r>
+          <m:r xmlns:m="http://schemas.openxmlformats.org/officeDocument/2006/math">
+            <m:t xmlns:m="http://schemas.openxmlformats.org/officeDocument/2006/math">𝑥</m:t>
+          </m:r>
+          <m:r xmlns:m="http://schemas.openxmlformats.org/officeDocument/2006/math">
+            <m:t xmlns:m="http://schemas.openxmlformats.org/officeDocument/2006/math"> </m:t>
+          </m:r>
+          <m:sSub xmlns:m="http://schemas.openxmlformats.org/officeDocument/2006/math">
+            <m:sSubPr>
+              <m:ctrlPr/>
+            </m:sSubPr>
+            <m:e>
+              <m:r>
+                <m:t>𝜀</m:t>
+              </m:r>
+            </m:e>
+            <m:sub>
+              <m:r>
+                <m:t>𝑖𝑗𝑡</m:t>
+              </m:r>
+            </m:sub>
+          </m:sSub>
+        </m:oMath>
+      </m:oMathPara>
     </w:p>
     <w:p>
       <w:pPr>
@@ -1045,7 +1313,247 @@
         <w:jc w:val="both"/>
       </w:pPr>
       <w:r>
-        <w:t xml:space="preserve">where Xijt is the bilateral flow, dij is distance, Lang and Colony are indicators for common official language and colonial tie, μjt are EU-partner by year fixed effects, and ηi are ACP-country fixed effects. The EU-partner-year fixed effects absorb the EU-side multilateral resistance term, while the ACP-country fixed effects absorb only time-invariant exporter heterogeneity. The time-varying ACP-side multilateral resistance term is not separately controlled here, following the practical trade-off Head and Mayer (2014) and Baier, Bergstrand, and Feng (2014) describe for gravity models with endogenous trade agreements. A time-varying ACP-specific shock, a commodity boom or an infrastructure investment, would raise both intra-regional and EU-bound trade simultaneously, biasing the disjoint specification’s positive coefficients upward; this works against the paper’s stumbling-block finding, since it would inflate an expansion estimate that is already modest in magnitude, rather than manufacture one where none exists. A separate year effect is not included because μjt spans it. </w:t>
+        <w:rPr/>
+        <w:t>W</w:t>
+      </w:r>
+      <w:r>
+        <w:rPr/>
+        <w:t>h</w:t>
+      </w:r>
+      <w:r>
+        <w:rPr/>
+        <w:t>ere</w:t>
+      </w:r>
+      <w:r>
+        <w:rPr/>
+        <w:t xml:space="preserve"> </w:t>
+      </w:r>
+      <m:oMathPara xmlns:m="http://schemas.openxmlformats.org/officeDocument/2006/math">
+        <m:oMath xmlns:m="http://schemas.openxmlformats.org/officeDocument/2006/math">
+          <m:sSub xmlns:m="http://schemas.openxmlformats.org/officeDocument/2006/math">
+            <m:sSubPr>
+              <m:ctrlPr/>
+            </m:sSubPr>
+            <m:e>
+              <m:r>
+                <m:t>𝑋</m:t>
+              </m:r>
+            </m:e>
+            <m:sub>
+              <m:r>
+                <m:t>𝑖𝑗𝑡</m:t>
+              </m:r>
+            </m:sub>
+          </m:sSub>
+        </m:oMath>
+      </m:oMathPara>
+      <w:r>
+        <w:rPr/>
+        <w:t xml:space="preserve"> </w:t>
+      </w:r>
+      <w:r>
+        <w:rPr/>
+        <w:t>is the bilateral fl</w:t>
+      </w:r>
+      <w:r>
+        <w:rPr/>
+        <w:t>ow,</w:t>
+      </w:r>
+      <w:r>
+        <w:rPr/>
+        <w:t xml:space="preserve"> </w:t>
+      </w:r>
+      <m:oMathPara xmlns:m="http://schemas.openxmlformats.org/officeDocument/2006/math">
+        <m:oMath xmlns:m="http://schemas.openxmlformats.org/officeDocument/2006/math">
+          <m:sSub xmlns:m="http://schemas.openxmlformats.org/officeDocument/2006/math">
+            <m:sSubPr>
+              <m:ctrlPr/>
+            </m:sSubPr>
+            <m:e>
+              <m:r>
+                <m:t>𝑑</m:t>
+              </m:r>
+            </m:e>
+            <m:sub>
+              <m:r>
+                <m:t>𝑖𝑗</m:t>
+              </m:r>
+            </m:sub>
+          </m:sSub>
+        </m:oMath>
+      </m:oMathPara>
+      <w:r>
+        <w:rPr/>
+        <w:t xml:space="preserve"> is distance, </w:t>
+      </w:r>
+      <m:oMathPara xmlns:m="http://schemas.openxmlformats.org/officeDocument/2006/math">
+        <m:oMath xmlns:m="http://schemas.openxmlformats.org/officeDocument/2006/math">
+          <m:r xmlns:m="http://schemas.openxmlformats.org/officeDocument/2006/math">
+            <m:t xmlns:m="http://schemas.openxmlformats.org/officeDocument/2006/math">𝐿𝑎𝑛𝑔</m:t>
+          </m:r>
+          <m:r xmlns:m="http://schemas.openxmlformats.org/officeDocument/2006/math">
+            <m:t xmlns:m="http://schemas.openxmlformats.org/officeDocument/2006/math"> </m:t>
+          </m:r>
+        </m:oMath>
+      </m:oMathPara>
+      <w:r>
+        <w:rPr/>
+        <w:t xml:space="preserve">and </w:t>
+      </w:r>
+      <m:oMathPara xmlns:m="http://schemas.openxmlformats.org/officeDocument/2006/math">
+        <m:oMath xmlns:m="http://schemas.openxmlformats.org/officeDocument/2006/math">
+          <m:r xmlns:m="http://schemas.openxmlformats.org/officeDocument/2006/math">
+            <m:t xmlns:m="http://schemas.openxmlformats.org/officeDocument/2006/math">𝐶𝑜𝑙𝑜𝑛𝑦</m:t>
+          </m:r>
+          <m:r xmlns:m="http://schemas.openxmlformats.org/officeDocument/2006/math">
+            <m:t xmlns:m="http://schemas.openxmlformats.org/officeDocument/2006/math"> </m:t>
+          </m:r>
+        </m:oMath>
+      </m:oMathPara>
+      <w:r>
+        <w:rPr/>
+        <w:t>are indicat</w:t>
+      </w:r>
+      <w:r>
+        <w:rPr/>
+        <w:t>ors for</w:t>
+      </w:r>
+      <w:r>
+        <w:rPr/>
+        <w:t xml:space="preserve"> common offic</w:t>
+      </w:r>
+      <w:r>
+        <w:rPr/>
+        <w:t>ial language and colonial tie,</w:t>
+      </w:r>
+      <w:r>
+        <w:rPr/>
+        <w:t xml:space="preserve"> </w:t>
+      </w:r>
+      <m:oMathPara xmlns:m="http://schemas.openxmlformats.org/officeDocument/2006/math">
+        <m:oMath xmlns:m="http://schemas.openxmlformats.org/officeDocument/2006/math">
+          <m:sSub xmlns:m="http://schemas.openxmlformats.org/officeDocument/2006/math">
+            <m:sSubPr>
+              <m:ctrlPr/>
+            </m:sSubPr>
+            <m:e>
+              <m:r>
+                <m:t>𝜇</m:t>
+              </m:r>
+            </m:e>
+            <m:sub>
+              <m:r>
+                <m:t>𝑗𝑡</m:t>
+              </m:r>
+            </m:sub>
+          </m:sSub>
+        </m:oMath>
+      </m:oMathPara>
+      <w:r>
+        <w:rPr/>
+        <w:t xml:space="preserve"> </w:t>
+      </w:r>
+      <w:r>
+        <w:rPr/>
+        <w:t xml:space="preserve">are EU-partner by year fixed effects, and </w:t>
+      </w:r>
+      <m:oMathPara xmlns:m="http://schemas.openxmlformats.org/officeDocument/2006/math">
+        <m:oMath xmlns:m="http://schemas.openxmlformats.org/officeDocument/2006/math">
+          <m:sSub xmlns:m="http://schemas.openxmlformats.org/officeDocument/2006/math">
+            <m:sSubPr>
+              <m:ctrlPr/>
+            </m:sSubPr>
+            <m:e>
+              <m:r>
+                <m:t>𝜂</m:t>
+              </m:r>
+            </m:e>
+            <m:sub>
+              <m:r>
+                <m:t>𝑖</m:t>
+              </m:r>
+            </m:sub>
+          </m:sSub>
+        </m:oMath>
+      </m:oMathPara>
+      <w:r>
+        <w:rPr/>
+        <w:t xml:space="preserve"> are AC</w:t>
+      </w:r>
+      <w:r>
+        <w:rPr/>
+        <w:t>P-country fixed effects. The EU-</w:t>
+      </w:r>
+      <w:r>
+        <w:rPr/>
+        <w:t>partner-ye</w:t>
+      </w:r>
+      <w:r>
+        <w:rPr/>
+        <w:t xml:space="preserve">ar fixed effects absorb the EU-side multilateral resistance term, while the ACP-country fixed effects absorb only time-invariant </w:t>
+      </w:r>
+      <w:r>
+        <w:rPr/>
+        <w:t>exporter</w:t>
+      </w:r>
+      <w:r>
+        <w:rPr/>
+        <w:t xml:space="preserve"> </w:t>
+      </w:r>
+      <w:r>
+        <w:rPr/>
+        <w:t xml:space="preserve">heterogeneity. The time-varying ACP-side multilateral resistance term is </w:t>
+      </w:r>
+      <w:r>
+        <w:rPr/>
+        <w:t>not sepa</w:t>
+      </w:r>
+      <w:r>
+        <w:rPr/>
+        <w:t xml:space="preserve">rately controlled here, following the practical trade-off Head and Mayer (2014) and Baier, Bergstrand, and Feng (2014) </w:t>
+      </w:r>
+      <w:r>
+        <w:rPr/>
+        <w:t>describe for</w:t>
+      </w:r>
+      <w:r>
+        <w:rPr/>
+        <w:t xml:space="preserve"> gravity models with endogenous trade agreements. A time-varying ACP-specific shock,</w:t>
+      </w:r>
+      <w:r>
+        <w:rPr/>
+        <w:t xml:space="preserve"> a c</w:t>
+      </w:r>
+      <w:r>
+        <w:rPr/>
+        <w:t>ommodity boom or an infrastructure investment, would raise both intra-regional and EU-bound trade simultaneously, biasing the disjoint specification’s positive coefficients upward; this works against the paper’s stumbling-block finding, since it would inflate an expansion estimate that is already modest in magnitude, rather than manufacture one where none exists. A separate year effect is not included because</w:t>
+      </w:r>
+      <w:r>
+        <w:rPr/>
+        <w:t xml:space="preserve"> </w:t>
+      </w:r>
+      <m:oMathPara xmlns:m="http://schemas.openxmlformats.org/officeDocument/2006/math">
+        <m:oMath xmlns:m="http://schemas.openxmlformats.org/officeDocument/2006/math">
+          <m:sSub xmlns:m="http://schemas.openxmlformats.org/officeDocument/2006/math">
+            <m:sSubPr>
+              <m:ctrlPr/>
+            </m:sSubPr>
+            <m:e>
+              <m:r>
+                <m:t>𝜇</m:t>
+              </m:r>
+            </m:e>
+            <m:sub>
+              <m:r>
+                <m:t>𝑗𝑡</m:t>
+              </m:r>
+            </m:sub>
+          </m:sSub>
+        </m:oMath>
+      </m:oMathPara>
+      <w:r>
+        <w:rPr/>
+        <w:t xml:space="preserve"> spans it.</w:t>
       </w:r>
     </w:p>
     <w:p>
@@ -1062,7 +1570,7 @@
         <w:pStyle w:val="Heading3"/>
         <w:jc w:val="both"/>
       </w:pPr>
-      <w:bookmarkStart w:id="13" w:name="X6d35cb2651dced0be603ba1b512a14ce9361434"/>
+      <w:bookmarkStart w:name="X6d35cb2651dced0be603ba1b512a14ce9361434" w:id="13"/>
       <w:bookmarkEnd w:id="12"/>
       <w:r>
         <w:t xml:space="preserve">4.3 </w:t>
@@ -1086,227 +1594,297 @@
         <w:jc w:val="both"/>
       </w:pPr>
       <w:r>
+        <w:rPr/>
         <w:t xml:space="preserve">Write </w:t>
       </w:r>
-      <m:oMath>
-        <m:sSub>
-          <m:sSubPr>
-            <m:ctrlPr>
-              <w:rPr>
-                <w:rFonts w:ascii="Cambria Math" w:hAnsi="Cambria Math"/>
-              </w:rPr>
-            </m:ctrlPr>
-          </m:sSubPr>
-          <m:e>
-            <m:r>
-              <w:rPr>
-                <w:rFonts w:ascii="Cambria Math" w:hAnsi="Cambria Math"/>
-              </w:rPr>
-              <m:t>I</m:t>
-            </m:r>
-          </m:e>
-          <m:sub>
-            <m:r>
-              <w:rPr>
-                <w:rFonts w:ascii="Cambria Math" w:hAnsi="Cambria Math"/>
-              </w:rPr>
-              <m:t>ct</m:t>
-            </m:r>
-          </m:sub>
-        </m:sSub>
-      </m:oMath>
-      <w:r>
+      <m:oMathPara xmlns:m="http://schemas.openxmlformats.org/officeDocument/2006/math">
+        <m:oMath xmlns:m="http://schemas.openxmlformats.org/officeDocument/2006/math">
+          <m:sSub xmlns:m="http://schemas.openxmlformats.org/officeDocument/2006/math">
+            <m:sSubPr>
+              <m:ctrlPr/>
+            </m:sSubPr>
+            <m:e>
+              <m:r>
+                <m:t>𝐼</m:t>
+              </m:r>
+            </m:e>
+            <m:sub>
+              <m:r>
+                <m:t>𝑖𝑡</m:t>
+              </m:r>
+            </m:sub>
+          </m:sSub>
+        </m:oMath>
+      </m:oMathPara>
+      <w:r>
+        <w:rPr/>
         <w:t xml:space="preserve"> for country </w:t>
       </w:r>
-      <m:oMath>
-        <m:r>
-          <w:rPr>
+      <m:oMathPara xmlns:m="http://schemas.openxmlformats.org/officeDocument/2006/math">
+        <m:oMath xmlns:m="http://schemas.openxmlformats.org/officeDocument/2006/math">
+          <m:r xmlns:m="http://schemas.openxmlformats.org/officeDocument/2006/math">
+            <m:t xmlns:m="http://schemas.openxmlformats.org/officeDocument/2006/math">𝑖</m:t>
+          </m:r>
+          <m:r xmlns:m="http://schemas.openxmlformats.org/officeDocument/2006/math">
+            <m:t xmlns:m="http://schemas.openxmlformats.org/officeDocument/2006/math"> </m:t>
+          </m:r>
+        </m:oMath>
+      </m:oMathPara>
+      <w:r>
+        <w:rPr/>
+        <w:t xml:space="preserve">’s intra-regional trade in year </w:t>
+      </w:r>
+      <m:oMath xmlns:m="http://schemas.openxmlformats.org/officeDocument/2006/math">
+        <m:r xmlns:m="http://schemas.openxmlformats.org/officeDocument/2006/math">
+          <w:rPr xmlns:w="http://schemas.openxmlformats.org/wordprocessingml/2006/main">
             <w:rFonts w:ascii="Cambria Math" w:hAnsi="Cambria Math"/>
           </w:rPr>
-          <m:t>c</m:t>
+          <m:t xmlns:m="http://schemas.openxmlformats.org/officeDocument/2006/math">t</m:t>
         </m:r>
       </m:oMath>
       <w:r>
-        <w:t xml:space="preserve">’s intra-regional trade in year </w:t>
-      </w:r>
-      <m:oMath>
-        <m:r>
-          <w:rPr>
-            <w:rFonts w:ascii="Cambria Math" w:hAnsi="Cambria Math"/>
-          </w:rPr>
-          <m:t>t</m:t>
-        </m:r>
-      </m:oMath>
-      <w:r>
+        <w:rPr/>
         <w:t xml:space="preserve">, </w:t>
       </w:r>
-      <m:oMath>
-        <m:sSub>
-          <m:sSubPr>
-            <m:ctrlPr>
-              <w:rPr>
-                <w:rFonts w:ascii="Cambria Math" w:hAnsi="Cambria Math"/>
-              </w:rPr>
-            </m:ctrlPr>
-          </m:sSubPr>
-          <m:e>
-            <m:r>
-              <w:rPr>
-                <w:rFonts w:ascii="Cambria Math" w:hAnsi="Cambria Math"/>
-              </w:rPr>
-              <m:t>T</m:t>
-            </m:r>
-          </m:e>
-          <m:sub>
-            <m:r>
-              <w:rPr>
-                <w:rFonts w:ascii="Cambria Math" w:hAnsi="Cambria Math"/>
-              </w:rPr>
-              <m:t>ct</m:t>
-            </m:r>
-          </m:sub>
-        </m:sSub>
-      </m:oMath>
-      <w:r>
+      <m:oMathPara xmlns:m="http://schemas.openxmlformats.org/officeDocument/2006/math">
+        <m:oMath xmlns:m="http://schemas.openxmlformats.org/officeDocument/2006/math">
+          <m:sSub xmlns:m="http://schemas.openxmlformats.org/officeDocument/2006/math">
+            <m:sSubPr>
+              <m:ctrlPr/>
+            </m:sSubPr>
+            <m:e>
+              <m:r>
+                <m:t>𝑇</m:t>
+              </m:r>
+            </m:e>
+            <m:sub>
+              <m:r>
+                <m:t>𝑖𝑡</m:t>
+              </m:r>
+            </m:sub>
+          </m:sSub>
+        </m:oMath>
+      </m:oMathPara>
+      <w:r>
+        <w:rPr/>
         <w:t xml:space="preserve"> for its total merchandise trade, </w:t>
       </w:r>
-      <m:oMath>
-        <m:sSub>
-          <m:sSubPr>
-            <m:ctrlPr>
-              <w:rPr>
-                <w:rFonts w:ascii="Cambria Math" w:hAnsi="Cambria Math"/>
-              </w:rPr>
-            </m:ctrlPr>
-          </m:sSubPr>
-          <m:e>
-            <m:r>
-              <w:rPr>
-                <w:rFonts w:ascii="Cambria Math" w:hAnsi="Cambria Math"/>
-              </w:rPr>
-              <m:t>E</m:t>
-            </m:r>
-          </m:e>
-          <m:sub>
-            <m:r>
-              <w:rPr>
-                <w:rFonts w:ascii="Cambria Math" w:hAnsi="Cambria Math"/>
-              </w:rPr>
-              <m:t>ct</m:t>
-            </m:r>
-          </m:sub>
-        </m:sSub>
-      </m:oMath>
-      <w:r>
+      <m:oMathPara xmlns:m="http://schemas.openxmlformats.org/officeDocument/2006/math">
+        <m:oMath xmlns:m="http://schemas.openxmlformats.org/officeDocument/2006/math">
+          <m:sSub xmlns:m="http://schemas.openxmlformats.org/officeDocument/2006/math">
+            <m:sSubPr>
+              <m:ctrlPr/>
+            </m:sSubPr>
+            <m:e>
+              <m:r>
+                <m:t>𝐸</m:t>
+              </m:r>
+            </m:e>
+            <m:sub>
+              <m:r>
+                <m:t>𝑖𝑡</m:t>
+              </m:r>
+            </m:sub>
+          </m:sSub>
+        </m:oMath>
+      </m:oMathPara>
+      <w:r>
+        <w:rPr/>
         <w:t xml:space="preserve"> for its trade with the EU, and </w:t>
       </w:r>
-      <m:oMath>
-        <m:sSub>
-          <m:sSubPr>
-            <m:ctrlPr>
-              <w:rPr>
-                <w:rFonts w:ascii="Cambria Math" w:hAnsi="Cambria Math"/>
-              </w:rPr>
-            </m:ctrlPr>
-          </m:sSubPr>
-          <m:e>
-            <m:r>
-              <w:rPr>
-                <w:rFonts w:ascii="Cambria Math" w:hAnsi="Cambria Math"/>
-              </w:rPr>
-              <m:t>N</m:t>
-            </m:r>
-          </m:e>
-          <m:sub>
-            <m:r>
-              <w:rPr>
-                <w:rFonts w:ascii="Cambria Math" w:hAnsi="Cambria Math"/>
-              </w:rPr>
-              <m:t>ct</m:t>
-            </m:r>
-          </m:sub>
-        </m:sSub>
-        <m:r>
-          <m:rPr>
-            <m:sty m:val="p"/>
-          </m:rPr>
-          <w:rPr>
-            <w:rFonts w:ascii="Cambria Math" w:hAnsi="Cambria Math"/>
-          </w:rPr>
-          <m:t>=</m:t>
-        </m:r>
-        <m:sSub>
-          <m:sSubPr>
-            <m:ctrlPr>
-              <w:rPr>
-                <w:rFonts w:ascii="Cambria Math" w:hAnsi="Cambria Math"/>
-              </w:rPr>
-            </m:ctrlPr>
-          </m:sSubPr>
-          <m:e>
-            <m:r>
-              <w:rPr>
-                <w:rFonts w:ascii="Cambria Math" w:hAnsi="Cambria Math"/>
-              </w:rPr>
-              <m:t>T</m:t>
-            </m:r>
-          </m:e>
-          <m:sub>
-            <m:r>
-              <w:rPr>
-                <w:rFonts w:ascii="Cambria Math" w:hAnsi="Cambria Math"/>
-              </w:rPr>
-              <m:t>ct</m:t>
-            </m:r>
-          </m:sub>
-        </m:sSub>
-        <m:r>
-          <m:rPr>
-            <m:sty m:val="p"/>
-          </m:rPr>
-          <w:rPr>
-            <w:rFonts w:ascii="Cambria Math" w:hAnsi="Cambria Math"/>
-          </w:rPr>
-          <m:t>-</m:t>
-        </m:r>
-        <m:sSub>
-          <m:sSubPr>
-            <m:ctrlPr>
-              <w:rPr>
-                <w:rFonts w:ascii="Cambria Math" w:hAnsi="Cambria Math"/>
-              </w:rPr>
-            </m:ctrlPr>
-          </m:sSubPr>
-          <m:e>
-            <m:r>
-              <w:rPr>
-                <w:rFonts w:ascii="Cambria Math" w:hAnsi="Cambria Math"/>
-              </w:rPr>
-              <m:t>E</m:t>
-            </m:r>
-          </m:e>
-          <m:sub>
-            <m:r>
-              <w:rPr>
-                <w:rFonts w:ascii="Cambria Math" w:hAnsi="Cambria Math"/>
-              </w:rPr>
-              <m:t>ct</m:t>
-            </m:r>
-          </m:sub>
-        </m:sSub>
-      </m:oMath>
-      <w:r>
+      <m:oMathPara xmlns:m="http://schemas.openxmlformats.org/officeDocument/2006/math">
+        <m:oMath xmlns:m="http://schemas.openxmlformats.org/officeDocument/2006/math">
+          <m:sSub xmlns:m="http://schemas.openxmlformats.org/officeDocument/2006/math">
+            <m:sSubPr>
+              <m:ctrlPr/>
+            </m:sSubPr>
+            <m:e>
+              <m:r>
+                <m:t>𝑁</m:t>
+              </m:r>
+            </m:e>
+            <m:sub>
+              <m:r>
+                <m:t>𝑖𝑡</m:t>
+              </m:r>
+            </m:sub>
+          </m:sSub>
+          <m:r xmlns:m="http://schemas.openxmlformats.org/officeDocument/2006/math">
+            <m:t xmlns:m="http://schemas.openxmlformats.org/officeDocument/2006/math">=</m:t>
+          </m:r>
+          <m:sSub xmlns:m="http://schemas.openxmlformats.org/officeDocument/2006/math">
+            <m:sSubPr>
+              <m:ctrlPr/>
+            </m:sSubPr>
+            <m:e>
+              <m:r>
+                <m:t>𝑇</m:t>
+              </m:r>
+            </m:e>
+            <m:sub>
+              <m:r>
+                <m:t>𝑖𝑡</m:t>
+              </m:r>
+            </m:sub>
+          </m:sSub>
+          <m:r xmlns:m="http://schemas.openxmlformats.org/officeDocument/2006/math">
+            <m:t xmlns:m="http://schemas.openxmlformats.org/officeDocument/2006/math">−</m:t>
+          </m:r>
+          <m:sSub xmlns:m="http://schemas.openxmlformats.org/officeDocument/2006/math">
+            <m:sSubPr>
+              <m:ctrlPr/>
+            </m:sSubPr>
+            <m:e>
+              <m:r>
+                <m:t>𝐸</m:t>
+              </m:r>
+            </m:e>
+            <m:sub>
+              <m:r>
+                <m:t>𝑖𝑡</m:t>
+              </m:r>
+            </m:sub>
+          </m:sSub>
+        </m:oMath>
+      </m:oMathPara>
+      <w:r>
+        <w:rPr/>
         <w:t xml:space="preserve"> for its trade with the rest of the world. The IT share and its ex-EU counterpart are</w:t>
       </w:r>
     </w:p>
     <w:p>
       <w:pPr>
         <w:pStyle w:val="BodyText"/>
-        <w:jc w:val="both"/>
-      </w:pPr>
-      <w:r>
-        <w:t>$$\text{IT}_{it} = \frac{I_{it}}{T_{it}}, \qquad \text{IT}^{\text{exEU}}_{it} = \frac{I_{it}}{N_{it}}$$</w:t>
-      </w:r>
+        <w:ind w:firstLine="0"/>
+        <w:jc w:val="center"/>
+      </w:pPr>
+      <m:oMathPara xmlns:m="http://schemas.openxmlformats.org/officeDocument/2006/math">
+        <m:oMath xmlns:m="http://schemas.openxmlformats.org/officeDocument/2006/math">
+          <m:sSub xmlns:m="http://schemas.openxmlformats.org/officeDocument/2006/math">
+            <m:sSubPr>
+              <m:ctrlPr/>
+            </m:sSubPr>
+            <m:e>
+              <m:r>
+                <m:rPr>
+                  <m:nor/>
+                </m:rPr>
+                <m:t>IT</m:t>
+              </m:r>
+            </m:e>
+            <m:sub>
+              <m:r>
+                <m:t>𝑖𝑡</m:t>
+              </m:r>
+            </m:sub>
+          </m:sSub>
+          <m:r xmlns:m="http://schemas.openxmlformats.org/officeDocument/2006/math">
+            <m:t xmlns:m="http://schemas.openxmlformats.org/officeDocument/2006/math">=</m:t>
+          </m:r>
+          <m:f xmlns:m="http://schemas.openxmlformats.org/officeDocument/2006/math">
+            <m:fPr>
+              <m:ctrlPr/>
+            </m:fPr>
+            <m:num>
+              <m:sSub>
+                <m:sSubPr>
+                  <m:ctrlPr/>
+                </m:sSubPr>
+                <m:e>
+                  <m:r>
+                    <m:t>𝐼</m:t>
+                  </m:r>
+                </m:e>
+                <m:sub>
+                  <m:r>
+                    <m:t>𝑖𝑡</m:t>
+                  </m:r>
+                </m:sub>
+              </m:sSub>
+            </m:num>
+            <m:den>
+              <m:sSub>
+                <m:sSubPr>
+                  <m:ctrlPr/>
+                </m:sSubPr>
+                <m:e>
+                  <m:r>
+                    <m:t>𝑇</m:t>
+                  </m:r>
+                </m:e>
+                <m:sub>
+                  <m:r>
+                    <m:t>𝑖𝑡</m:t>
+                  </m:r>
+                </m:sub>
+              </m:sSub>
+            </m:den>
+          </m:f>
+          <m:r xmlns:m="http://schemas.openxmlformats.org/officeDocument/2006/math">
+            <m:t xmlns:m="http://schemas.openxmlformats.org/officeDocument/2006/math">,   </m:t>
+          </m:r>
+          <m:sSup xmlns:m="http://schemas.openxmlformats.org/officeDocument/2006/math">
+            <m:sSupPr>
+              <m:ctrlPr/>
+            </m:sSupPr>
+            <m:e>
+              <m:r>
+                <m:rPr>
+                  <m:nor/>
+                </m:rPr>
+                <m:t>IT</m:t>
+              </m:r>
+            </m:e>
+            <m:sup>
+              <m:r>
+                <m:t>𝑒𝑥𝐸𝑈</m:t>
+              </m:r>
+            </m:sup>
+          </m:sSup>
+          <m:r xmlns:m="http://schemas.openxmlformats.org/officeDocument/2006/math">
+            <m:t xmlns:m="http://schemas.openxmlformats.org/officeDocument/2006/math">=</m:t>
+          </m:r>
+          <m:f xmlns:m="http://schemas.openxmlformats.org/officeDocument/2006/math">
+            <m:fPr>
+              <m:ctrlPr/>
+            </m:fPr>
+            <m:num>
+              <m:sSub>
+                <m:sSubPr>
+                  <m:ctrlPr/>
+                </m:sSubPr>
+                <m:e>
+                  <m:r>
+                    <m:t>𝐼</m:t>
+                  </m:r>
+                </m:e>
+                <m:sub>
+                  <m:r>
+                    <m:t>𝑖𝑡</m:t>
+                  </m:r>
+                </m:sub>
+              </m:sSub>
+            </m:num>
+            <m:den>
+              <m:sSub>
+                <m:sSubPr>
+                  <m:ctrlPr/>
+                </m:sSubPr>
+                <m:e>
+                  <m:r>
+                    <m:t>𝑇</m:t>
+                  </m:r>
+                </m:e>
+                <m:sub>
+                  <m:r>
+                    <m:t>𝑖𝑡</m:t>
+                  </m:r>
+                </m:sub>
+              </m:sSub>
+            </m:den>
+          </m:f>
+        </m:oMath>
+      </m:oMathPara>
     </w:p>
     <w:p>
       <w:pPr>
@@ -1426,11 +2004,102 @@
     <w:p>
       <w:pPr>
         <w:pStyle w:val="BodyText"/>
-        <w:jc w:val="both"/>
-      </w:pPr>
-      <w:r>
-        <w:t>$$\text{IT}_{it} = \text{IT}^{\text{exEU}}_{it} \cdot (1 - s^{EU}_{it}) \tag{1}$$</w:t>
-      </w:r>
+        <w:jc w:val="center"/>
+      </w:pPr>
+      <m:oMathPara xmlns:m="http://schemas.openxmlformats.org/officeDocument/2006/math">
+        <m:oMath xmlns:m="http://schemas.openxmlformats.org/officeDocument/2006/math">
+          <m:sSub xmlns:m="http://schemas.openxmlformats.org/officeDocument/2006/math">
+            <m:sSubPr>
+              <m:ctrlPr/>
+            </m:sSubPr>
+            <m:e>
+              <m:r>
+                <m:rPr>
+                  <m:nor/>
+                </m:rPr>
+                <m:t>IT</m:t>
+              </m:r>
+            </m:e>
+            <m:sub>
+              <m:r>
+                <m:t>𝑖𝑡</m:t>
+              </m:r>
+            </m:sub>
+          </m:sSub>
+          <m:r xmlns:m="http://schemas.openxmlformats.org/officeDocument/2006/math">
+            <m:t xmlns:m="http://schemas.openxmlformats.org/officeDocument/2006/math">=</m:t>
+          </m:r>
+          <m:sSubSup xmlns:m="http://schemas.openxmlformats.org/officeDocument/2006/math">
+            <m:sSubSupPr>
+              <m:ctrlPr/>
+            </m:sSubSupPr>
+            <m:e>
+              <m:r>
+                <m:rPr>
+                  <m:nor/>
+                </m:rPr>
+                <m:t>IT</m:t>
+              </m:r>
+            </m:e>
+            <m:sub>
+              <m:r>
+                <m:t>𝑖𝑡</m:t>
+              </m:r>
+            </m:sub>
+            <m:sup>
+              <m:r>
+                <m:t>𝑒𝑥𝐸𝑈</m:t>
+              </m:r>
+            </m:sup>
+          </m:sSubSup>
+          <m:r xmlns:m="http://schemas.openxmlformats.org/officeDocument/2006/math">
+            <m:t xmlns:m="http://schemas.openxmlformats.org/officeDocument/2006/math"> ∙ </m:t>
+          </m:r>
+          <m:d xmlns:m="http://schemas.openxmlformats.org/officeDocument/2006/math">
+            <m:dPr>
+              <m:ctrlPr/>
+            </m:dPr>
+            <m:e>
+              <m:r>
+                <m:t>1−</m:t>
+              </m:r>
+              <m:sSubSup>
+                <m:sSubSupPr>
+                  <m:ctrlPr/>
+                </m:sSubSupPr>
+                <m:e>
+                  <m:r>
+                    <m:t>𝑠</m:t>
+                  </m:r>
+                </m:e>
+                <m:sub>
+                  <m:r>
+                    <m:t>𝑖𝑡</m:t>
+                  </m:r>
+                </m:sub>
+                <m:sup>
+                  <m:r>
+                    <m:t>𝐸𝑈</m:t>
+                  </m:r>
+                </m:sup>
+              </m:sSubSup>
+            </m:e>
+          </m:d>
+          <m:r xmlns:m="http://schemas.openxmlformats.org/officeDocument/2006/math">
+            <m:t xmlns:m="http://schemas.openxmlformats.org/officeDocument/2006/math">     </m:t>
+          </m:r>
+          <m:d xmlns:m="http://schemas.openxmlformats.org/officeDocument/2006/math">
+            <m:dPr>
+              <m:ctrlPr/>
+            </m:dPr>
+            <m:e>
+              <m:r>
+                <m:t>1</m:t>
+              </m:r>
+            </m:e>
+          </m:d>
+        </m:oMath>
+      </m:oMathPara>
     </w:p>
     <w:p>
       <w:pPr>
@@ -1438,73 +2107,80 @@
         <w:jc w:val="both"/>
       </w:pPr>
       <w:r>
+        <w:rPr/>
         <w:t>Equation (1) shows where the mechanical link comes from. The baseline regressor includes the factor</w:t>
       </w:r>
       <w:r>
+        <w:rPr/>
         <w:t xml:space="preserve">, </w:t>
       </w:r>
-      <m:oMath>
-        <m:r>
-          <w:rPr>
-            <w:rFonts w:ascii="Cambria Math" w:hAnsi="Cambria Math"/>
-          </w:rPr>
-          <m:t>1-</m:t>
-        </m:r>
-        <m:sSubSup>
-          <m:sSubSupPr>
-            <m:ctrlPr>
-              <w:rPr>
-                <w:rFonts w:ascii="Cambria Math" w:hAnsi="Cambria Math"/>
-              </w:rPr>
-            </m:ctrlPr>
-          </m:sSubSupPr>
-          <m:e>
-            <m:r>
-              <w:rPr>
-                <w:rFonts w:ascii="Cambria Math" w:hAnsi="Cambria Math"/>
-              </w:rPr>
-              <m:t>s</m:t>
-            </m:r>
-          </m:e>
-          <m:sub>
-            <m:r>
-              <w:rPr>
-                <w:rFonts w:ascii="Cambria Math" w:hAnsi="Cambria Math"/>
-              </w:rPr>
-              <m:t>ct</m:t>
-            </m:r>
-          </m:sub>
-          <m:sup>
-            <m:r>
-              <w:rPr>
-                <w:rFonts w:ascii="Cambria Math" w:hAnsi="Cambria Math"/>
-              </w:rPr>
-              <m:t>EU</m:t>
-            </m:r>
-          </m:sup>
-        </m:sSubSup>
-      </m:oMath>
-      <w:r>
+      <m:oMathPara xmlns:m="http://schemas.openxmlformats.org/officeDocument/2006/math">
+        <m:oMath xmlns:m="http://schemas.openxmlformats.org/officeDocument/2006/math">
+          <m:r xmlns:m="http://schemas.openxmlformats.org/officeDocument/2006/math">
+            <m:t xmlns:m="http://schemas.openxmlformats.org/officeDocument/2006/math">1−</m:t>
+          </m:r>
+          <m:sSubSup xmlns:m="http://schemas.openxmlformats.org/officeDocument/2006/math">
+            <m:sSubSupPr>
+              <m:ctrlPr/>
+            </m:sSubSupPr>
+            <m:e>
+              <m:r>
+                <m:t>𝑠</m:t>
+              </m:r>
+            </m:e>
+            <m:sub>
+              <m:r>
+                <m:t>𝑖𝑡</m:t>
+              </m:r>
+            </m:sub>
+            <m:sup>
+              <m:r>
+                <m:t>𝐸𝑈</m:t>
+              </m:r>
+            </m:sup>
+          </m:sSubSup>
+        </m:oMath>
+      </m:oMathPara>
+      <w:r>
+        <w:rPr/>
         <w:t xml:space="preserve">, </w:t>
       </w:r>
       <w:r>
-        <w:t>which falls mechanically whenever the country's EU trade rises, and the dependent variable in every specification is a component of that same EU trade,</w:t>
-      </w:r>
-      <w:r>
+        <w:rPr/>
+        <w:t>which falls mechanically whenever the country's EU trade rises, and</w:t>
+      </w:r>
+      <w:r>
+        <w:rPr/>
+        <w:t xml:space="preserve"> the dep</w:t>
+      </w:r>
+      <w:r>
+        <w:rPr/>
+        <w:t xml:space="preserve">endent variable in every specification is a </w:t>
+      </w:r>
+      <w:r>
+        <w:rPr/>
+        <w:t>component</w:t>
+      </w:r>
+      <w:r>
+        <w:rPr/>
+        <w:t xml:space="preserve"> of that same EU trade,</w:t>
+      </w:r>
+      <w:r>
+        <w:rPr/>
         <w:t xml:space="preserve"> since </w:t>
       </w:r>
-      <m:oMath>
-        <m:sSub>
+      <m:oMath xmlns:m="http://schemas.openxmlformats.org/officeDocument/2006/math">
+        <m:sSub xmlns:m="http://schemas.openxmlformats.org/officeDocument/2006/math">
           <m:sSubPr>
             <m:ctrlPr>
-              <w:rPr>
+              <w:rPr xmlns:w="http://schemas.openxmlformats.org/wordprocessingml/2006/main">
                 <w:rFonts w:ascii="Cambria Math" w:hAnsi="Cambria Math"/>
               </w:rPr>
             </m:ctrlPr>
           </m:sSubPr>
           <m:e>
             <m:r>
-              <w:rPr>
+              <w:rPr xmlns:w="http://schemas.openxmlformats.org/wordprocessingml/2006/main">
                 <w:rFonts w:ascii="Cambria Math" w:hAnsi="Cambria Math"/>
               </w:rPr>
               <m:t>E</m:t>
@@ -1512,7 +2188,7 @@
           </m:e>
           <m:sub>
             <m:r>
-              <w:rPr>
+              <w:rPr xmlns:w="http://schemas.openxmlformats.org/wordprocessingml/2006/main">
                 <w:rFonts w:ascii="Cambria Math" w:hAnsi="Cambria Math"/>
               </w:rPr>
               <m:t>ct</m:t>
@@ -1521,13 +2197,14 @@
         </m:sSub>
       </m:oMath>
       <w:r>
+        <w:rPr/>
         <w:t xml:space="preserve"> is the sum of the bilateral flows across the EU partners. Part of any negative coefficient on </w:t>
       </w:r>
-      <m:oMath>
-        <m:sSub>
+      <m:oMath xmlns:m="http://schemas.openxmlformats.org/officeDocument/2006/math">
+        <m:sSub xmlns:m="http://schemas.openxmlformats.org/officeDocument/2006/math">
           <m:sSubPr>
             <m:ctrlPr>
-              <w:rPr>
+              <w:rPr xmlns:w="http://schemas.openxmlformats.org/wordprocessingml/2006/main">
                 <w:rFonts w:ascii="Cambria Math" w:hAnsi="Cambria Math"/>
               </w:rPr>
             </m:ctrlPr>
@@ -1537,7 +2214,7 @@
               <m:rPr>
                 <m:sty m:val="p"/>
               </m:rPr>
-              <w:rPr>
+              <w:rPr xmlns:w="http://schemas.openxmlformats.org/wordprocessingml/2006/main">
                 <w:rFonts w:ascii="Cambria Math" w:hAnsi="Cambria Math"/>
               </w:rPr>
               <m:t>IT</m:t>
@@ -1545,7 +2222,7 @@
           </m:e>
           <m:sub>
             <m:r>
-              <w:rPr>
+              <w:rPr xmlns:w="http://schemas.openxmlformats.org/wordprocessingml/2006/main">
                 <w:rFonts w:ascii="Cambria Math" w:hAnsi="Cambria Math"/>
               </w:rPr>
               <m:t>ct</m:t>
@@ -1554,9 +2231,11 @@
         </m:sSub>
       </m:oMath>
       <w:r>
+        <w:rPr/>
         <w:t xml:space="preserve"> is therefore arithmetic rather than economic. </w:t>
       </w:r>
       <w:r>
+        <w:rPr/>
         <w:t>As in the Introduction, the EU absorbs roughly one-fifth of ACP merchandise trade over the sample on average (pooled across country-years), rising to 0.339 for Central Africa and 0.316 for ECOWAS and falling to 0.074 for PIF, so the channel is large enough to matter for every bloc in the sample.</w:t>
       </w:r>
     </w:p>
@@ -1566,7 +2245,117 @@
         <w:jc w:val="both"/>
       </w:pPr>
       <w:r>
-        <w:t>Removing the EU from the denominator addresses the arithmetic but creates a scaling problem. Since the ex-EU share is larger than the IT share by a factor of 1/(1−sEU), the two coefficients are not directly comparable in magnitude. A third measure holds the EU component of the denominator at each country’s own average EU dependence rather than removing it entirely. Because that average does not vary over time, the mechanical channel is attenuated much as it is under full removal, though the denominator still contains total trade, itself a function of EU trade, so some residual dependence likely remains:</w:t>
+        <w:rPr/>
+        <w:t xml:space="preserve">Removing the EU from the denominator addresses </w:t>
+      </w:r>
+      <w:r>
+        <w:rPr/>
+        <w:t>the arit</w:t>
+      </w:r>
+      <w:r>
+        <w:rPr/>
+        <w:t>hmetic but c</w:t>
+      </w:r>
+      <w:r>
+        <w:rPr/>
+        <w:t xml:space="preserve">reates </w:t>
+      </w:r>
+      <w:r>
+        <w:rPr/>
+        <w:t xml:space="preserve">a scaling problem. Since the ex-EU share is larger than the IT share by a factor of </w:t>
+      </w:r>
+      <m:oMathPara xmlns:m="http://schemas.openxmlformats.org/officeDocument/2006/math">
+        <m:oMath xmlns:m="http://schemas.openxmlformats.org/officeDocument/2006/math">
+          <m:f xmlns:m="http://schemas.openxmlformats.org/officeDocument/2006/math">
+            <m:fPr>
+              <m:ctrlPr/>
+            </m:fPr>
+            <m:num>
+              <m:r>
+                <m:t>1</m:t>
+              </m:r>
+            </m:num>
+            <m:den>
+              <m:d>
+                <m:dPr>
+                  <m:ctrlPr/>
+                </m:dPr>
+                <m:e>
+                  <m:r>
+                    <m:t>1−</m:t>
+                  </m:r>
+                  <m:sSup>
+                    <m:sSupPr>
+                      <m:ctrlPr/>
+                    </m:sSupPr>
+                    <m:e>
+                      <m:r>
+                        <m:t>𝑠</m:t>
+                      </m:r>
+                    </m:e>
+                    <m:sup>
+                      <m:r>
+                        <m:t>𝐸𝑈</m:t>
+                      </m:r>
+                    </m:sup>
+                  </m:sSup>
+                </m:e>
+              </m:d>
+            </m:den>
+          </m:f>
+        </m:oMath>
+      </m:oMathPara>
+      <w:r>
+        <w:rPr/>
+        <w:t>, t</w:t>
+      </w:r>
+      <w:r>
+        <w:rPr/>
+        <w:t>he two co</w:t>
+      </w:r>
+      <w:r>
+        <w:rPr/>
+        <w:t xml:space="preserve">efficients are not directly comparable in </w:t>
+      </w:r>
+      <w:r>
+        <w:rPr/>
+        <w:t>magnitude</w:t>
+      </w:r>
+      <w:r>
+        <w:rPr/>
+        <w:t xml:space="preserve">. A third measure holds the EU </w:t>
+      </w:r>
+      <w:r>
+        <w:rPr/>
+        <w:t>component</w:t>
+      </w:r>
+      <w:r>
+        <w:rPr/>
+        <w:t xml:space="preserve"> of the denominator at each country’s own average EU dependence rat</w:t>
+      </w:r>
+      <w:r>
+        <w:rPr/>
+        <w:t xml:space="preserve">her than </w:t>
+      </w:r>
+      <w:r>
+        <w:rPr/>
+        <w:t xml:space="preserve">removing it entirely. Because that average does not vary over time, the mechanical channel is attenuated much as it is under full removal, though the denominator still </w:t>
+      </w:r>
+      <w:r>
+        <w:rPr/>
+        <w:t>contains</w:t>
+      </w:r>
+      <w:r>
+        <w:rPr/>
+        <w:t xml:space="preserve"> total trade, itself a function of EU trade, so some residual dependence </w:t>
+      </w:r>
+      <w:r>
+        <w:rPr/>
+        <w:t>likely remains</w:t>
+      </w:r>
+      <w:r>
+        <w:rPr/>
+        <w:t>:</w:t>
       </w:r>
     </w:p>
     <w:p>
@@ -1575,213 +2364,529 @@
           <w:tab w:val="center" w:pos="4680"/>
           <w:tab w:val="right" w:pos="9350"/>
         </w:tabs>
-        <w:jc w:val="both"/>
+        <w:jc w:val="center"/>
         <w:rPr>
-          <w:rFonts w:ascii="Times New Roman" w:eastAsia="Times New Roman" w:hAnsi="Times New Roman" w:cs="Times New Roman"/>
+          <w:rFonts w:ascii="Times New Roman" w:hAnsi="Times New Roman" w:eastAsia="Times New Roman" w:cs="Times New Roman"/>
           <w:color w:val="000000" w:themeColor="text1"/>
         </w:rPr>
       </w:pPr>
-      <w:r>
+      <m:oMathPara xmlns:m="http://schemas.openxmlformats.org/officeDocument/2006/math">
+        <m:oMath xmlns:m="http://schemas.openxmlformats.org/officeDocument/2006/math">
+          <m:sSubSup xmlns:m="http://schemas.openxmlformats.org/officeDocument/2006/math">
+            <m:sSubSupPr>
+              <m:ctrlPr/>
+            </m:sSubSupPr>
+            <m:e>
+              <m:r>
+                <m:rPr>
+                  <m:nor/>
+                </m:rPr>
+                <m:t>IT</m:t>
+              </m:r>
+            </m:e>
+            <m:sub>
+              <m:r>
+                <m:t>𝑖𝑡</m:t>
+              </m:r>
+            </m:sub>
+            <m:sup>
+              <m:r>
+                <m:rPr>
+                  <m:nor/>
+                </m:rPr>
+                <m:t>fix</m:t>
+              </m:r>
+              <m:r>
+                <m:t>−</m:t>
+              </m:r>
+              <m:r>
+                <m:t>𝐸𝑈</m:t>
+              </m:r>
+            </m:sup>
+          </m:sSubSup>
+          <m:r xmlns:m="http://schemas.openxmlformats.org/officeDocument/2006/math">
+            <m:t xmlns:m="http://schemas.openxmlformats.org/officeDocument/2006/math">=</m:t>
+          </m:r>
+          <m:sSubSup xmlns:m="http://schemas.openxmlformats.org/officeDocument/2006/math">
+            <m:sSubSupPr>
+              <m:ctrlPr/>
+            </m:sSubSupPr>
+            <m:e>
+              <m:r>
+                <m:rPr>
+                  <m:nor/>
+                </m:rPr>
+                <m:t>IT</m:t>
+              </m:r>
+            </m:e>
+            <m:sub>
+              <m:r>
+                <m:t>𝑖𝑡</m:t>
+              </m:r>
+            </m:sub>
+            <m:sup>
+              <m:r>
+                <m:t>𝑒𝑥</m:t>
+              </m:r>
+              <m:r>
+                <m:t>−</m:t>
+              </m:r>
+              <m:r>
+                <m:t>𝐸𝑈</m:t>
+              </m:r>
+            </m:sup>
+          </m:sSubSup>
+          <m:r xmlns:m="http://schemas.openxmlformats.org/officeDocument/2006/math">
+            <m:t xmlns:m="http://schemas.openxmlformats.org/officeDocument/2006/math">,    </m:t>
+          </m:r>
+          <m:sSubSup xmlns:m="http://schemas.openxmlformats.org/officeDocument/2006/math">
+            <m:sSubSupPr>
+              <m:ctrlPr/>
+            </m:sSubSupPr>
+            <m:e>
+              <m:bar>
+                <m:barPr>
+                  <m:pos m:val="top"/>
+                  <m:ctrlPr/>
+                </m:barPr>
+                <m:e>
+                  <m:r>
+                    <m:t>𝑠</m:t>
+                  </m:r>
+                </m:e>
+              </m:bar>
+            </m:e>
+            <m:sub>
+              <m:r>
+                <m:t>𝑖</m:t>
+              </m:r>
+            </m:sub>
+            <m:sup>
+              <m:r>
+                <m:t>𝐸𝑈</m:t>
+              </m:r>
+            </m:sup>
+          </m:sSubSup>
+          <m:r xmlns:m="http://schemas.openxmlformats.org/officeDocument/2006/math">
+            <m:t xmlns:m="http://schemas.openxmlformats.org/officeDocument/2006/math">=</m:t>
+          </m:r>
+          <m:f xmlns:m="http://schemas.openxmlformats.org/officeDocument/2006/math">
+            <m:fPr>
+              <m:ctrlPr/>
+            </m:fPr>
+            <m:num>
+              <m:r>
+                <m:t>1</m:t>
+              </m:r>
+            </m:num>
+            <m:den>
+              <m:bar>
+                <m:barPr>
+                  <m:pos m:val="top"/>
+                  <m:ctrlPr/>
+                </m:barPr>
+                <m:e>
+                  <m:d>
+                    <m:dPr>
+                      <m:begChr m:val="|"/>
+                      <m:endChr m:val="|"/>
+                      <m:ctrlPr/>
+                    </m:dPr>
+                    <m:e>
+                      <m:sSub>
+                        <m:sSubPr>
+                          <m:ctrlPr/>
+                        </m:sSubPr>
+                        <m:e>
+                          <m:r>
+                            <m:t>𝑇</m:t>
+                          </m:r>
+                        </m:e>
+                        <m:sub>
+                          <m:r>
+                            <m:t>𝑖</m:t>
+                          </m:r>
+                        </m:sub>
+                      </m:sSub>
+                    </m:e>
+                  </m:d>
+                </m:e>
+              </m:bar>
+            </m:den>
+          </m:f>
+          <m:nary xmlns:m="http://schemas.openxmlformats.org/officeDocument/2006/math">
+            <m:naryPr>
+              <m:chr m:val="∑"/>
+              <m:ctrlPr/>
+            </m:naryPr>
+            <m:sub>
+              <m:r>
+                <m:t> </m:t>
+              </m:r>
+              <m:r>
+                <m:t>𝑡</m:t>
+              </m:r>
+              <m:r>
+                <m:t>∈</m:t>
+              </m:r>
+              <m:sSub>
+                <m:sSubPr>
+                  <m:ctrlPr/>
+                </m:sSubPr>
+                <m:e>
+                  <m:r>
+                    <m:t>𝑇</m:t>
+                  </m:r>
+                </m:e>
+                <m:sub>
+                  <m:r>
+                    <m:t>𝑖</m:t>
+                  </m:r>
+                </m:sub>
+              </m:sSub>
+            </m:sub>
+            <m:sup>
+              <m:r>
+                <m:t> </m:t>
+              </m:r>
+            </m:sup>
+            <m:e>
+              <m:sSubSup>
+                <m:sSubSupPr>
+                  <m:ctrlPr/>
+                </m:sSubSupPr>
+                <m:e>
+                  <m:r>
+                    <m:t>𝑠</m:t>
+                  </m:r>
+                </m:e>
+                <m:sub>
+                  <m:r>
+                    <m:t>𝑖𝑡</m:t>
+                  </m:r>
+                </m:sub>
+                <m:sup>
+                  <m:r>
+                    <m:t>𝐸𝑈</m:t>
+                  </m:r>
+                </m:sup>
+              </m:sSubSup>
+            </m:e>
+          </m:nary>
+          <m:r xmlns:m="http://schemas.openxmlformats.org/officeDocument/2006/math">
+            <m:t xmlns:m="http://schemas.openxmlformats.org/officeDocument/2006/math">     </m:t>
+          </m:r>
+          <m:d xmlns:m="http://schemas.openxmlformats.org/officeDocument/2006/math">
+            <m:dPr>
+              <m:ctrlPr/>
+            </m:dPr>
+            <m:e>
+              <m:r>
+                <m:t>2</m:t>
+              </m:r>
+            </m:e>
+          </m:d>
+        </m:oMath>
+      </m:oMathPara>
+    </w:p>
+    <w:p>
+      <w:pPr>
+        <w:pStyle w:val="FirstParagraph"/>
+        <w:jc w:val="both"/>
+      </w:pPr>
+      <w:r>
+        <w:rPr/>
+        <w:t>This construction removes time variation in the denominator's EU component, attenuating the mechanical channel</w:t>
+      </w:r>
+      <w:r>
+        <w:rPr/>
+        <w:t>, while leaving time variation in intra-regional trade and n</w:t>
+      </w:r>
+      <w:r>
+        <w:rPr/>
+        <w:t>on-EU tra</w:t>
+      </w:r>
+      <w:r>
+        <w:rPr/>
+        <w:t xml:space="preserve">de untouched. Because equation (2) differs from the IT share only in replacing </w:t>
+      </w:r>
+      <m:oMathPara xmlns:m="http://schemas.openxmlformats.org/officeDocument/2006/math">
+        <m:oMath xmlns:m="http://schemas.openxmlformats.org/officeDocument/2006/math">
+          <m:sSubSup xmlns:m="http://schemas.openxmlformats.org/officeDocument/2006/math">
+            <m:sSubSupPr>
+              <m:ctrlPr/>
+            </m:sSubSupPr>
+            <m:e>
+              <m:r>
+                <m:t>𝑠</m:t>
+              </m:r>
+            </m:e>
+            <m:sub>
+              <m:r>
+                <m:t>𝑖𝑡</m:t>
+              </m:r>
+            </m:sub>
+            <m:sup>
+              <m:r>
+                <m:t>𝐸𝑈</m:t>
+              </m:r>
+            </m:sup>
+          </m:sSubSup>
+        </m:oMath>
+      </m:oMathPara>
+      <w:r>
+        <w:rPr/>
+        <w:t xml:space="preserve"> with its time-invariant average </w:t>
+      </w:r>
+      <m:oMathPara xmlns:m="http://schemas.openxmlformats.org/officeDocument/2006/math">
+        <m:oMath xmlns:m="http://schemas.openxmlformats.org/officeDocument/2006/math">
+          <m:sSubSup xmlns:m="http://schemas.openxmlformats.org/officeDocument/2006/math">
+            <m:sSubSupPr>
+              <m:ctrlPr/>
+            </m:sSubSupPr>
+            <m:e>
+              <m:r>
+                <m:t>𝑠</m:t>
+              </m:r>
+            </m:e>
+            <m:sub>
+              <m:r>
+                <m:t>𝑖</m:t>
+              </m:r>
+            </m:sub>
+            <m:sup>
+              <m:r>
+                <m:t>−</m:t>
+              </m:r>
+              <m:r>
+                <m:t>𝐸𝑈</m:t>
+              </m:r>
+            </m:sup>
+          </m:sSubSup>
+        </m:oMath>
+      </m:oMathPara>
+      <w:r>
+        <w:rPr/>
+        <w:t xml:space="preserve">, the two regressors are directly comparable in </w:t>
+      </w:r>
+      <w:r>
+        <w:rPr/>
+        <w:t>magnitude</w:t>
+      </w:r>
+      <w:r>
+        <w:rPr/>
+        <w:t>.</w:t>
+      </w:r>
+    </w:p>
+    <w:p>
+      <w:pPr>
+        <w:pStyle w:val="BodyText"/>
+        <w:jc w:val="both"/>
+      </w:pPr>
+      <w:r>
+        <w:t>Beyond the denominator's contents, the ratio form itself creates a further problem. Taking logs,</w:t>
+      </w:r>
+    </w:p>
+    <w:p>
+      <w:pPr>
+        <w:pStyle w:val="BodyText"/>
+        <w:jc w:val="center"/>
+      </w:pPr>
+      <m:oMathPara xmlns:m="http://schemas.openxmlformats.org/officeDocument/2006/math">
+        <m:oMath xmlns:m="http://schemas.openxmlformats.org/officeDocument/2006/math">
+          <m:func xmlns:m="http://schemas.openxmlformats.org/officeDocument/2006/math">
+            <m:funcPr>
+              <m:ctrlPr/>
+            </m:funcPr>
+            <m:fName>
+              <m:r>
+                <m:rPr>
+                  <m:sty m:val="p"/>
+                </m:rPr>
+                <m:t>ln</m:t>
+              </m:r>
+            </m:fName>
+            <m:e>
+              <m:d>
+                <m:dPr>
+                  <m:ctrlPr/>
+                </m:dPr>
+                <m:e>
+                  <m:sSub>
+                    <m:sSubPr>
+                      <m:ctrlPr/>
+                    </m:sSubPr>
+                    <m:e>
+                      <m:r>
+                        <m:rPr>
+                          <m:nor/>
+                        </m:rPr>
+                        <m:t>IT</m:t>
+                      </m:r>
+                    </m:e>
+                    <m:sub>
+                      <m:r>
+                        <m:t>𝑖𝑡</m:t>
+                      </m:r>
+                    </m:sub>
+                  </m:sSub>
+                </m:e>
+              </m:d>
+            </m:e>
+          </m:func>
+          <m:r xmlns:m="http://schemas.openxmlformats.org/officeDocument/2006/math">
+            <m:t xmlns:m="http://schemas.openxmlformats.org/officeDocument/2006/math"> = </m:t>
+          </m:r>
+          <m:func xmlns:m="http://schemas.openxmlformats.org/officeDocument/2006/math">
+            <m:funcPr>
+              <m:ctrlPr/>
+            </m:funcPr>
+            <m:fName>
+              <m:r>
+                <m:rPr>
+                  <m:sty m:val="p"/>
+                </m:rPr>
+                <m:t>ln</m:t>
+              </m:r>
+            </m:fName>
+            <m:e>
+              <m:d>
+                <m:dPr>
+                  <m:ctrlPr/>
+                </m:dPr>
+                <m:e>
+                  <m:sSub>
+                    <m:sSubPr>
+                      <m:ctrlPr/>
+                    </m:sSubPr>
+                    <m:e>
+                      <m:r>
+                        <m:t>𝐼</m:t>
+                      </m:r>
+                    </m:e>
+                    <m:sub>
+                      <m:r>
+                        <m:t>𝑖𝑡</m:t>
+                      </m:r>
+                    </m:sub>
+                  </m:sSub>
+                </m:e>
+              </m:d>
+            </m:e>
+          </m:func>
+          <m:r xmlns:m="http://schemas.openxmlformats.org/officeDocument/2006/math">
+            <m:t xmlns:m="http://schemas.openxmlformats.org/officeDocument/2006/math">−</m:t>
+          </m:r>
+          <m:func xmlns:m="http://schemas.openxmlformats.org/officeDocument/2006/math">
+            <m:funcPr>
+              <m:ctrlPr/>
+            </m:funcPr>
+            <m:fName>
+              <m:r>
+                <m:rPr>
+                  <m:sty m:val="p"/>
+                </m:rPr>
+                <m:t>ln</m:t>
+              </m:r>
+            </m:fName>
+            <m:e>
+              <m:d>
+                <m:dPr>
+                  <m:ctrlPr/>
+                </m:dPr>
+                <m:e>
+                  <m:sSub>
+                    <m:sSubPr>
+                      <m:ctrlPr/>
+                    </m:sSubPr>
+                    <m:e>
+                      <m:r>
+                        <m:t>𝑁</m:t>
+                      </m:r>
+                    </m:e>
+                    <m:sub>
+                      <m:r>
+                        <m:t>𝑖𝑡</m:t>
+                      </m:r>
+                    </m:sub>
+                  </m:sSub>
+                </m:e>
+              </m:d>
+            </m:e>
+          </m:func>
+        </m:oMath>
+      </m:oMathPara>
+    </w:p>
+    <w:p>
+      <w:pPr>
+        <w:pStyle w:val="FirstParagraph"/>
+        <w:jc w:val="both"/>
+      </w:pPr>
+      <w:r>
+        <w:t>so entering the share as a single regressor is equivalent to entering numerator and denominator separately under the constraint</w:t>
+      </w:r>
+    </w:p>
+    <w:p>
+      <w:pPr>
+        <w:spacing w:before="180" w:after="180"/>
+        <w:jc w:val="center"/>
         <w:rPr>
-          <w:noProof/>
-        </w:rPr>
-        <w:drawing>
-          <wp:inline distT="0" distB="0" distL="0" distR="0" wp14:anchorId="3C8EC632" wp14:editId="5F307010">
-            <wp:extent cx="3695700" cy="323850"/>
-            <wp:effectExtent l="0" t="0" r="0" b="0"/>
-            <wp:docPr id="58432002" name="drawing"/>
-            <wp:cNvGraphicFramePr>
-              <a:graphicFrameLocks xmlns:a="http://schemas.openxmlformats.org/drawingml/2006/main" noChangeAspect="1"/>
-            </wp:cNvGraphicFramePr>
-            <a:graphic xmlns:a="http://schemas.openxmlformats.org/drawingml/2006/main">
-              <a:graphicData uri="http://schemas.openxmlformats.org/drawingml/2006/picture">
-                <pic:pic xmlns:pic="http://schemas.openxmlformats.org/drawingml/2006/picture">
-                  <pic:nvPicPr>
-                    <pic:cNvPr id="58432002" name="Picture 58432002"/>
-                    <pic:cNvPicPr/>
-                  </pic:nvPicPr>
-                  <pic:blipFill>
-                    <a:blip r:embed="rId8">
-                      <a:extLst>
-                        <a:ext uri="{28A0092B-C50C-407E-A947-70E740481C1C}">
-                          <a14:useLocalDpi xmlns:a14="http://schemas.microsoft.com/office/drawing/2010/main"/>
-                        </a:ext>
-                      </a:extLst>
-                    </a:blip>
-                    <a:stretch>
-                      <a:fillRect/>
-                    </a:stretch>
-                  </pic:blipFill>
-                  <pic:spPr>
-                    <a:xfrm>
-                      <a:off x="0" y="0"/>
-                      <a:ext cx="3695700" cy="323850"/>
-                    </a:xfrm>
-                    <a:prstGeom prst="rect">
-                      <a:avLst/>
-                    </a:prstGeom>
-                  </pic:spPr>
-                </pic:pic>
-              </a:graphicData>
-            </a:graphic>
-          </wp:inline>
-        </w:drawing>
-      </w:r>
-      <w:r>
-        <w:rPr>
-          <w:rFonts w:ascii="Times New Roman" w:eastAsia="Times New Roman" w:hAnsi="Times New Roman" w:cs="Times New Roman"/>
-          <w:color w:val="000000" w:themeColor="text1"/>
-        </w:rPr>
-        <w:t>(2)</w:t>
-      </w:r>
-    </w:p>
-    <w:p>
-      <w:pPr>
-        <w:pStyle w:val="FirstParagraph"/>
-        <w:jc w:val="both"/>
-      </w:pPr>
-      <w:r>
-        <w:t>This construction removes time variation in the denominator's EU component, attenuating the mechanical channel</w:t>
-      </w:r>
-      <w:r>
-        <w:t xml:space="preserve">, while leaving time variation in intra-regional trade and non-EU trade untouched. Because equation (2) differs from the IT share only in replacing </w:t>
-      </w:r>
-      <m:oMath>
-        <m:sSubSup>
-          <m:sSubSupPr>
-            <m:ctrlPr>
-              <w:rPr>
-                <w:rFonts w:ascii="Cambria Math" w:hAnsi="Cambria Math"/>
-              </w:rPr>
-            </m:ctrlPr>
-          </m:sSubSupPr>
-          <m:e>
-            <m:r>
-              <w:rPr>
-                <w:rFonts w:ascii="Cambria Math" w:hAnsi="Cambria Math"/>
-              </w:rPr>
-              <m:t>s</m:t>
-            </m:r>
-          </m:e>
-          <m:sub>
-            <m:r>
-              <w:rPr>
-                <w:rFonts w:ascii="Cambria Math" w:hAnsi="Cambria Math"/>
-              </w:rPr>
-              <m:t>ct</m:t>
-            </m:r>
-          </m:sub>
-          <m:sup>
-            <m:r>
-              <w:rPr>
-                <w:rFonts w:ascii="Cambria Math" w:hAnsi="Cambria Math"/>
-              </w:rPr>
-              <m:t>EU</m:t>
-            </m:r>
-          </m:sup>
-        </m:sSubSup>
-      </m:oMath>
-      <w:r>
-        <w:t xml:space="preserve"> with its time-invariant average </w:t>
-      </w:r>
-      <m:oMath>
-        <m:sSubSup>
-          <m:sSubSupPr>
-            <m:ctrlPr>
-              <w:rPr>
-                <w:rFonts w:ascii="Cambria Math" w:hAnsi="Cambria Math"/>
-              </w:rPr>
-            </m:ctrlPr>
-          </m:sSubSupPr>
-          <m:e>
-            <m:acc>
-              <m:accPr>
-                <m:chr m:val="‾"/>
-                <m:ctrlPr>
-                  <w:rPr>
-                    <w:rFonts w:ascii="Cambria Math" w:hAnsi="Cambria Math"/>
-                  </w:rPr>
-                </m:ctrlPr>
-              </m:accPr>
-              <m:e>
-                <m:r>
-                  <w:rPr>
-                    <w:rFonts w:ascii="Cambria Math" w:hAnsi="Cambria Math"/>
-                  </w:rPr>
-                  <m:t>s</m:t>
-                </m:r>
-              </m:e>
-            </m:acc>
-          </m:e>
-          <m:sub>
-            <m:r>
-              <w:rPr>
-                <w:rFonts w:ascii="Cambria Math" w:hAnsi="Cambria Math"/>
-              </w:rPr>
-              <m:t>c</m:t>
-            </m:r>
-          </m:sub>
-          <m:sup>
-            <m:r>
-              <w:rPr>
-                <w:rFonts w:ascii="Cambria Math" w:hAnsi="Cambria Math"/>
-              </w:rPr>
-              <m:t>EU</m:t>
-            </m:r>
-          </m:sup>
-        </m:sSubSup>
-      </m:oMath>
-      <w:r>
-        <w:t>, the two regressors are directly comparable in magnitude.</w:t>
-      </w:r>
-    </w:p>
-    <w:p>
-      <w:pPr>
-        <w:pStyle w:val="BodyText"/>
-        <w:jc w:val="both"/>
-      </w:pPr>
-      <w:r>
-        <w:t>Beyond the denominator's contents, the ratio form itself creates a further problem. Taking logs,</w:t>
-      </w:r>
-    </w:p>
-    <w:p>
-      <w:pPr>
-        <w:pStyle w:val="BodyText"/>
-        <w:jc w:val="both"/>
-      </w:pPr>
-      <w:r>
-        <w:rPr>
-          <w:rFonts w:ascii="Times New Roman" w:eastAsia="Times New Roman" w:hAnsi="Times New Roman" w:cs="Times New Roman"/>
-          <w:color w:val="000000" w:themeColor="text1"/>
+          <w:rFonts w:ascii="Times New Roman" w:hAnsi="Times New Roman" w:eastAsia="Times New Roman" w:cs="Times New Roman"/>
+          <w:color w:val="000000" w:themeColor="text1" w:themeTint="FF" w:themeShade="FF"/>
           <w:sz w:val="22"/>
           <w:szCs w:val="22"/>
         </w:rPr>
-        <w:t>ln(IT Sharect) = ln(Ict) − ln(Nct) (3a)</w:t>
-      </w:r>
-    </w:p>
-    <w:p>
-      <w:pPr>
-        <w:pStyle w:val="FirstParagraph"/>
-        <w:jc w:val="both"/>
-      </w:pPr>
-      <w:r>
-        <w:t>so entering the share as a single regressor is equivalent to entering numerator and denominator separately under the constraint</w:t>
-      </w:r>
-    </w:p>
-    <w:p>
-      <w:pPr>
-        <w:spacing w:before="180" w:after="180"/>
-        <w:jc w:val="both"/>
-      </w:pPr>
-      <w:r>
-        <w:rPr>
-          <w:rFonts w:ascii="Times New Roman" w:eastAsia="Times New Roman" w:hAnsi="Times New Roman" w:cs="Times New Roman"/>
-          <w:color w:val="000000" w:themeColor="text1"/>
-          <w:sz w:val="22"/>
-          <w:szCs w:val="22"/>
-        </w:rPr>
-        <w:t>βI + βN = 0 (3)</w:t>
-      </w:r>
+      </w:pPr>
+      <m:oMathPara xmlns:m="http://schemas.openxmlformats.org/officeDocument/2006/math">
+        <m:oMath xmlns:m="http://schemas.openxmlformats.org/officeDocument/2006/math">
+          <m:sSub xmlns:m="http://schemas.openxmlformats.org/officeDocument/2006/math">
+            <m:sSubPr>
+              <m:ctrlPr/>
+            </m:sSubPr>
+            <m:e>
+              <m:r>
+                <m:t>𝛽</m:t>
+              </m:r>
+            </m:e>
+            <m:sub>
+              <m:r>
+                <m:t>𝐼</m:t>
+              </m:r>
+            </m:sub>
+          </m:sSub>
+          <m:r xmlns:m="http://schemas.openxmlformats.org/officeDocument/2006/math">
+            <m:t xmlns:m="http://schemas.openxmlformats.org/officeDocument/2006/math">+</m:t>
+          </m:r>
+          <m:sSub xmlns:m="http://schemas.openxmlformats.org/officeDocument/2006/math">
+            <m:sSubPr>
+              <m:ctrlPr/>
+            </m:sSubPr>
+            <m:e>
+              <m:r>
+                <m:t>𝛽</m:t>
+              </m:r>
+            </m:e>
+            <m:sub>
+              <m:r>
+                <m:t>𝑁</m:t>
+              </m:r>
+            </m:sub>
+          </m:sSub>
+          <m:r xmlns:m="http://schemas.openxmlformats.org/officeDocument/2006/math">
+            <m:t xmlns:m="http://schemas.openxmlformats.org/officeDocument/2006/math"> = 0      </m:t>
+          </m:r>
+          <m:d xmlns:m="http://schemas.openxmlformats.org/officeDocument/2006/math">
+            <m:dPr>
+              <m:ctrlPr/>
+            </m:dPr>
+            <m:e>
+              <m:r>
+                <m:t>3</m:t>
+              </m:r>
+            </m:e>
+          </m:d>
+        </m:oMath>
+      </m:oMathPara>
     </w:p>
     <w:p>
       <w:pPr>
@@ -2360,7 +3465,7 @@
         <w:pStyle w:val="Heading2"/>
         <w:jc w:val="both"/>
       </w:pPr>
-      <w:bookmarkStart w:id="14" w:name="results"/>
+      <w:bookmarkStart w:name="results" w:id="14"/>
       <w:bookmarkEnd w:id="9"/>
       <w:bookmarkEnd w:id="13"/>
       <w:r>
@@ -2381,7 +3486,7 @@
         <w:pStyle w:val="Heading3"/>
         <w:jc w:val="both"/>
       </w:pPr>
-      <w:bookmarkStart w:id="15" w:name="the-pooled-estimate"/>
+      <w:bookmarkStart w:name="the-pooled-estimate" w:id="15"/>
       <w:r>
         <w:t>5.1 The Pooled Estimate</w:t>
       </w:r>
@@ -3304,7 +4409,13 @@
         <w:jc w:val="both"/>
       </w:pPr>
       <w:r>
-        <w:t>The estimate holds across alternative estimators, sample exclusions, and clustering choices. Negative binomial PML gives −2.284 (SE 0.531), while OLS on logged trade, which drops zero-trade dyads, gives −1.673 (SE 0.458), and OLS on log(1 + trade), which retains them, gives −1.516 (SE 0.421). The coefficient is similarly insensitive to which countries are excluded: dropping South Africa gives −2.150, dropping Nigeria gives −1.927, dropping the SACU members gives −1.954, dropping the United Kingdom gives −2.042, and restricting to the African subsample alone gives −2.164. Somalia and Eritrea are already absent from the estimating sample, Somalia for lack of any REC assignment and Eritrea for a missing-GDP gap, so their omission is not itself a robustness check. The result is also robust to clustering choice, staying significant at the one percent level whether standard errors are clustered on the dyad (SE 0.410), the ACP country (0.604), ACP country and EU partner (0.560), or ACP country and year (0.658).</w:t>
+        <w:t xml:space="preserve">The estimate holds across alternative estimators, sample exclusions, and clustering choices. Negative binomial PML gives −2.284 (SE 0.531), while OLS on logged trade, which drops zero-trade dyads, gives −1.673 (SE 0.458), and OLS on log(1 + trade), which retains them, gives −1.516 (SE 0.421). The coefficient is similarly insensitive to which countries are excluded: dropping South Africa gives −2.150, dropping Nigeria gives −1.927, dropping the SACU members gives −1.954, dropping the United Kingdom gives −2.042, and restricting to the African subsample alone gives −2.164. </w:t>
+      </w:r>
+      <w:r>
+        <w:t xml:space="preserve">Somalia is absent from the estimating sample throughout, for lack of any REC assignment, so its omission is not itself a robustness check. Eritrea is present throughout the sample period. Dropping it removes 548 observations (Table 8, column 6) without moving the IT Share coefficient. </w:t>
+      </w:r>
+      <w:r>
+        <w:t>The result is also robust to clustering choice, staying significant at the one percent level whether standard errors are clustered on the dyad (SE 0.410), the ACP country (0.604), ACP country and EU partner (0.560), or ACP country and year (0.658).</w:t>
       </w:r>
     </w:p>
     <w:p>
@@ -3321,7 +4432,7 @@
         <w:pStyle w:val="Heading3"/>
         <w:jc w:val="both"/>
       </w:pPr>
-      <w:bookmarkStart w:id="16" w:name="the-share-form-is-rejected"/>
+      <w:bookmarkStart w:name="the-share-form-is-rejected" w:id="16"/>
       <w:bookmarkEnd w:id="15"/>
       <w:r>
         <w:t>5.2 The Share Form Is Rejected</w:t>
@@ -3372,17 +4483,21 @@
         </w:trPr>
         <w:tc>
           <w:tcPr>
-            <w:tcW w:w="0" w:type="auto"/>
-          </w:tcPr>
-          <w:p>
-            <w:pPr>
-              <w:pStyle w:val="Compact"/>
-            </w:pPr>
-          </w:p>
-        </w:tc>
-        <w:tc>
-          <w:tcPr>
-            <w:tcW w:w="0" w:type="auto"/>
+            <w:cnfStyle w:val="000010000000" w:firstRow="0" w:lastRow="0" w:firstColumn="0" w:lastColumn="0" w:oddVBand="1" w:evenVBand="0" w:oddHBand="0" w:evenHBand="0" w:firstRowFirstColumn="0" w:firstRowLastColumn="0" w:lastRowFirstColumn="0" w:lastRowLastColumn="0"/>
+            <w:tcW w:w="0" w:type="auto"/>
+            <w:tcMar/>
+          </w:tcPr>
+          <w:p>
+            <w:pPr>
+              <w:pStyle w:val="Compact"/>
+            </w:pPr>
+          </w:p>
+        </w:tc>
+        <w:tc>
+          <w:tcPr>
+            <w:cnfStyle w:val="000001000000" w:firstRow="0" w:lastRow="0" w:firstColumn="0" w:lastColumn="0" w:oddVBand="0" w:evenVBand="1" w:oddHBand="0" w:evenHBand="0" w:firstRowFirstColumn="0" w:firstRowLastColumn="0" w:lastRowFirstColumn="0" w:lastRowLastColumn="0"/>
+            <w:tcW w:w="0" w:type="auto"/>
+            <w:tcMar/>
           </w:tcPr>
           <w:p>
             <w:pPr>
@@ -3395,7 +4510,9 @@
         </w:tc>
         <w:tc>
           <w:tcPr>
-            <w:tcW w:w="0" w:type="auto"/>
+            <w:cnfStyle w:val="000010000000" w:firstRow="0" w:lastRow="0" w:firstColumn="0" w:lastColumn="0" w:oddVBand="1" w:evenVBand="0" w:oddHBand="0" w:evenHBand="0" w:firstRowFirstColumn="0" w:firstRowLastColumn="0" w:lastRowFirstColumn="0" w:lastRowLastColumn="0"/>
+            <w:tcW w:w="0" w:type="auto"/>
+            <w:tcMar/>
           </w:tcPr>
           <w:p>
             <w:pPr>
@@ -3408,7 +4525,9 @@
         </w:tc>
         <w:tc>
           <w:tcPr>
-            <w:tcW w:w="0" w:type="auto"/>
+            <w:cnfStyle w:val="000001000000" w:firstRow="0" w:lastRow="0" w:firstColumn="0" w:lastColumn="0" w:oddVBand="0" w:evenVBand="1" w:oddHBand="0" w:evenHBand="0" w:firstRowFirstColumn="0" w:firstRowLastColumn="0" w:lastRowFirstColumn="0" w:lastRowLastColumn="0"/>
+            <w:tcW w:w="0" w:type="auto"/>
+            <w:tcMar/>
           </w:tcPr>
           <w:p>
             <w:pPr>
@@ -3421,7 +4540,9 @@
         </w:tc>
         <w:tc>
           <w:tcPr>
-            <w:tcW w:w="0" w:type="auto"/>
+            <w:cnfStyle w:val="000010000000" w:firstRow="0" w:lastRow="0" w:firstColumn="0" w:lastColumn="0" w:oddVBand="1" w:evenVBand="0" w:oddHBand="0" w:evenHBand="0" w:firstRowFirstColumn="0" w:firstRowLastColumn="0" w:lastRowFirstColumn="0" w:lastRowLastColumn="0"/>
+            <w:tcW w:w="0" w:type="auto"/>
+            <w:tcMar/>
           </w:tcPr>
           <w:p>
             <w:pPr>
@@ -3434,7 +4555,9 @@
         </w:tc>
         <w:tc>
           <w:tcPr>
-            <w:tcW w:w="0" w:type="auto"/>
+            <w:cnfStyle w:val="000001000000" w:firstRow="0" w:lastRow="0" w:firstColumn="0" w:lastColumn="0" w:oddVBand="0" w:evenVBand="1" w:oddHBand="0" w:evenHBand="0" w:firstRowFirstColumn="0" w:firstRowLastColumn="0" w:lastRowFirstColumn="0" w:lastRowLastColumn="0"/>
+            <w:tcW w:w="0" w:type="auto"/>
+            <w:tcMar/>
           </w:tcPr>
           <w:p>
             <w:pPr>
@@ -3452,7 +4575,9 @@
         </w:trPr>
         <w:tc>
           <w:tcPr>
-            <w:tcW w:w="0" w:type="auto"/>
+            <w:cnfStyle w:val="000010000000" w:firstRow="0" w:lastRow="0" w:firstColumn="0" w:lastColumn="0" w:oddVBand="1" w:evenVBand="0" w:oddHBand="0" w:evenHBand="0" w:firstRowFirstColumn="0" w:firstRowLastColumn="0" w:lastRowFirstColumn="0" w:lastRowLastColumn="0"/>
+            <w:tcW w:w="0" w:type="auto"/>
+            <w:tcMar/>
           </w:tcPr>
           <w:p>
             <w:pPr>
@@ -3465,7 +4590,9 @@
         </w:tc>
         <w:tc>
           <w:tcPr>
-            <w:tcW w:w="0" w:type="auto"/>
+            <w:cnfStyle w:val="000001000000" w:firstRow="0" w:lastRow="0" w:firstColumn="0" w:lastColumn="0" w:oddVBand="0" w:evenVBand="1" w:oddHBand="0" w:evenHBand="0" w:firstRowFirstColumn="0" w:firstRowLastColumn="0" w:lastRowFirstColumn="0" w:lastRowLastColumn="0"/>
+            <w:tcW w:w="0" w:type="auto"/>
+            <w:tcMar/>
           </w:tcPr>
           <w:p>
             <w:pPr>
@@ -3490,37 +4617,45 @@
         </w:tc>
         <w:tc>
           <w:tcPr>
-            <w:tcW w:w="0" w:type="auto"/>
-          </w:tcPr>
-          <w:p>
-            <w:pPr>
-              <w:pStyle w:val="Compact"/>
-            </w:pPr>
-          </w:p>
-        </w:tc>
-        <w:tc>
-          <w:tcPr>
-            <w:tcW w:w="0" w:type="auto"/>
-          </w:tcPr>
-          <w:p>
-            <w:pPr>
-              <w:pStyle w:val="Compact"/>
-            </w:pPr>
-          </w:p>
-        </w:tc>
-        <w:tc>
-          <w:tcPr>
-            <w:tcW w:w="0" w:type="auto"/>
-          </w:tcPr>
-          <w:p>
-            <w:pPr>
-              <w:pStyle w:val="Compact"/>
-            </w:pPr>
-          </w:p>
-        </w:tc>
-        <w:tc>
-          <w:tcPr>
-            <w:tcW w:w="0" w:type="auto"/>
+            <w:cnfStyle w:val="000010000000" w:firstRow="0" w:lastRow="0" w:firstColumn="0" w:lastColumn="0" w:oddVBand="1" w:evenVBand="0" w:oddHBand="0" w:evenHBand="0" w:firstRowFirstColumn="0" w:firstRowLastColumn="0" w:lastRowFirstColumn="0" w:lastRowLastColumn="0"/>
+            <w:tcW w:w="0" w:type="auto"/>
+            <w:tcMar/>
+          </w:tcPr>
+          <w:p>
+            <w:pPr>
+              <w:pStyle w:val="Compact"/>
+            </w:pPr>
+          </w:p>
+        </w:tc>
+        <w:tc>
+          <w:tcPr>
+            <w:cnfStyle w:val="000001000000" w:firstRow="0" w:lastRow="0" w:firstColumn="0" w:lastColumn="0" w:oddVBand="0" w:evenVBand="1" w:oddHBand="0" w:evenHBand="0" w:firstRowFirstColumn="0" w:firstRowLastColumn="0" w:lastRowFirstColumn="0" w:lastRowLastColumn="0"/>
+            <w:tcW w:w="0" w:type="auto"/>
+            <w:tcMar/>
+          </w:tcPr>
+          <w:p>
+            <w:pPr>
+              <w:pStyle w:val="Compact"/>
+            </w:pPr>
+          </w:p>
+        </w:tc>
+        <w:tc>
+          <w:tcPr>
+            <w:cnfStyle w:val="000010000000" w:firstRow="0" w:lastRow="0" w:firstColumn="0" w:lastColumn="0" w:oddVBand="1" w:evenVBand="0" w:oddHBand="0" w:evenHBand="0" w:firstRowFirstColumn="0" w:firstRowLastColumn="0" w:lastRowFirstColumn="0" w:lastRowLastColumn="0"/>
+            <w:tcW w:w="0" w:type="auto"/>
+            <w:tcMar/>
+          </w:tcPr>
+          <w:p>
+            <w:pPr>
+              <w:pStyle w:val="Compact"/>
+            </w:pPr>
+          </w:p>
+        </w:tc>
+        <w:tc>
+          <w:tcPr>
+            <w:cnfStyle w:val="000001000000" w:firstRow="0" w:lastRow="0" w:firstColumn="0" w:lastColumn="0" w:oddVBand="0" w:evenVBand="1" w:oddHBand="0" w:evenHBand="0" w:firstRowFirstColumn="0" w:firstRowLastColumn="0" w:lastRowFirstColumn="0" w:lastRowLastColumn="0"/>
+            <w:tcW w:w="0" w:type="auto"/>
+            <w:tcMar/>
           </w:tcPr>
           <w:p>
             <w:pPr>
@@ -3535,7 +4670,9 @@
         </w:trPr>
         <w:tc>
           <w:tcPr>
-            <w:tcW w:w="0" w:type="auto"/>
+            <w:cnfStyle w:val="000010000000" w:firstRow="0" w:lastRow="0" w:firstColumn="0" w:lastColumn="0" w:oddVBand="1" w:evenVBand="0" w:oddHBand="0" w:evenHBand="0" w:firstRowFirstColumn="0" w:firstRowLastColumn="0" w:lastRowFirstColumn="0" w:lastRowLastColumn="0"/>
+            <w:tcW w:w="0" w:type="auto"/>
+            <w:tcMar/>
           </w:tcPr>
           <w:p>
             <w:pPr>
@@ -3548,56 +4685,77 @@
         </w:tc>
         <w:tc>
           <w:tcPr>
-            <w:tcW w:w="0" w:type="auto"/>
-          </w:tcPr>
-          <w:p>
-            <w:pPr>
-              <w:pStyle w:val="Compact"/>
-            </w:pPr>
-          </w:p>
-        </w:tc>
-        <w:tc>
-          <w:tcPr>
-            <w:tcW w:w="0" w:type="auto"/>
-          </w:tcPr>
-          <w:p>
-            <w:pPr>
-              <w:pStyle w:val="Compact"/>
-            </w:pPr>
-            <w:r>
+            <w:cnfStyle w:val="000001000000" w:firstRow="0" w:lastRow="0" w:firstColumn="0" w:lastColumn="0" w:oddVBand="0" w:evenVBand="1" w:oddHBand="0" w:evenHBand="0" w:firstRowFirstColumn="0" w:firstRowLastColumn="0" w:lastRowFirstColumn="0" w:lastRowLastColumn="0"/>
+            <w:tcW w:w="0" w:type="auto"/>
+            <w:tcMar/>
+          </w:tcPr>
+          <w:p>
+            <w:pPr>
+              <w:pStyle w:val="Compact"/>
+            </w:pPr>
+          </w:p>
+        </w:tc>
+        <w:tc>
+          <w:tcPr>
+            <w:cnfStyle w:val="000010000000" w:firstRow="0" w:lastRow="0" w:firstColumn="0" w:lastColumn="0" w:oddVBand="1" w:evenVBand="0" w:oddHBand="0" w:evenHBand="0" w:firstRowFirstColumn="0" w:firstRowLastColumn="0" w:lastRowFirstColumn="0" w:lastRowLastColumn="0"/>
+            <w:tcW w:w="0" w:type="auto"/>
+            <w:tcMar/>
+          </w:tcPr>
+          <w:p>
+            <w:pPr>
+              <w:pStyle w:val="Compact"/>
+            </w:pPr>
+            <w:r>
+              <w:rPr/>
               <w:t>−0.2</w:t>
             </w:r>
             <w:r>
+              <w:rPr/>
               <w:t>58</w:t>
             </w:r>
             <w:r>
-              <w:t xml:space="preserve"> (0.510)</w:t>
-            </w:r>
-          </w:p>
-        </w:tc>
-        <w:tc>
-          <w:tcPr>
-            <w:tcW w:w="0" w:type="auto"/>
-          </w:tcPr>
-          <w:p>
-            <w:pPr>
-              <w:pStyle w:val="Compact"/>
-            </w:pPr>
-          </w:p>
-        </w:tc>
-        <w:tc>
-          <w:tcPr>
-            <w:tcW w:w="0" w:type="auto"/>
-          </w:tcPr>
-          <w:p>
-            <w:pPr>
-              <w:pStyle w:val="Compact"/>
-            </w:pPr>
-          </w:p>
-        </w:tc>
-        <w:tc>
-          <w:tcPr>
-            <w:tcW w:w="0" w:type="auto"/>
+              <w:rPr/>
+              <w:t xml:space="preserve"> (0.</w:t>
+            </w:r>
+            <w:r>
+              <w:rPr/>
+              <w:t>477</w:t>
+            </w:r>
+            <w:r>
+              <w:rPr/>
+              <w:t>)</w:t>
+            </w:r>
+          </w:p>
+        </w:tc>
+        <w:tc>
+          <w:tcPr>
+            <w:cnfStyle w:val="000001000000" w:firstRow="0" w:lastRow="0" w:firstColumn="0" w:lastColumn="0" w:oddVBand="0" w:evenVBand="1" w:oddHBand="0" w:evenHBand="0" w:firstRowFirstColumn="0" w:firstRowLastColumn="0" w:lastRowFirstColumn="0" w:lastRowLastColumn="0"/>
+            <w:tcW w:w="0" w:type="auto"/>
+            <w:tcMar/>
+          </w:tcPr>
+          <w:p>
+            <w:pPr>
+              <w:pStyle w:val="Compact"/>
+            </w:pPr>
+          </w:p>
+        </w:tc>
+        <w:tc>
+          <w:tcPr>
+            <w:cnfStyle w:val="000010000000" w:firstRow="0" w:lastRow="0" w:firstColumn="0" w:lastColumn="0" w:oddVBand="1" w:evenVBand="0" w:oddHBand="0" w:evenHBand="0" w:firstRowFirstColumn="0" w:firstRowLastColumn="0" w:lastRowFirstColumn="0" w:lastRowLastColumn="0"/>
+            <w:tcW w:w="0" w:type="auto"/>
+            <w:tcMar/>
+          </w:tcPr>
+          <w:p>
+            <w:pPr>
+              <w:pStyle w:val="Compact"/>
+            </w:pPr>
+          </w:p>
+        </w:tc>
+        <w:tc>
+          <w:tcPr>
+            <w:cnfStyle w:val="000001000000" w:firstRow="0" w:lastRow="0" w:firstColumn="0" w:lastColumn="0" w:oddVBand="0" w:evenVBand="1" w:oddHBand="0" w:evenHBand="0" w:firstRowFirstColumn="0" w:firstRowLastColumn="0" w:lastRowFirstColumn="0" w:lastRowLastColumn="0"/>
+            <w:tcW w:w="0" w:type="auto"/>
+            <w:tcMar/>
           </w:tcPr>
           <w:p>
             <w:pPr>
@@ -3612,7 +4770,9 @@
         </w:trPr>
         <w:tc>
           <w:tcPr>
-            <w:tcW w:w="0" w:type="auto"/>
+            <w:cnfStyle w:val="000010000000" w:firstRow="0" w:lastRow="0" w:firstColumn="0" w:lastColumn="0" w:oddVBand="1" w:evenVBand="0" w:oddHBand="0" w:evenHBand="0" w:firstRowFirstColumn="0" w:firstRowLastColumn="0" w:lastRowFirstColumn="0" w:lastRowLastColumn="0"/>
+            <w:tcW w:w="0" w:type="auto"/>
+            <w:tcMar/>
           </w:tcPr>
           <w:p>
             <w:pPr>
@@ -3625,50 +4785,72 @@
         </w:tc>
         <w:tc>
           <w:tcPr>
-            <w:tcW w:w="0" w:type="auto"/>
-          </w:tcPr>
-          <w:p>
-            <w:pPr>
-              <w:pStyle w:val="Compact"/>
-            </w:pPr>
-          </w:p>
-        </w:tc>
-        <w:tc>
-          <w:tcPr>
-            <w:tcW w:w="0" w:type="auto"/>
-          </w:tcPr>
-          <w:p>
-            <w:pPr>
-              <w:pStyle w:val="Compact"/>
-            </w:pPr>
-          </w:p>
-        </w:tc>
-        <w:tc>
-          <w:tcPr>
-            <w:tcW w:w="0" w:type="auto"/>
-          </w:tcPr>
-          <w:p>
-            <w:pPr>
-              <w:pStyle w:val="Compact"/>
-            </w:pPr>
-            <w:r>
-              <w:t>−0.294 (0.716)</w:t>
-            </w:r>
-          </w:p>
-        </w:tc>
-        <w:tc>
-          <w:tcPr>
-            <w:tcW w:w="0" w:type="auto"/>
-          </w:tcPr>
-          <w:p>
-            <w:pPr>
-              <w:pStyle w:val="Compact"/>
-            </w:pPr>
-          </w:p>
-        </w:tc>
-        <w:tc>
-          <w:tcPr>
-            <w:tcW w:w="0" w:type="auto"/>
+            <w:cnfStyle w:val="000001000000" w:firstRow="0" w:lastRow="0" w:firstColumn="0" w:lastColumn="0" w:oddVBand="0" w:evenVBand="1" w:oddHBand="0" w:evenHBand="0" w:firstRowFirstColumn="0" w:firstRowLastColumn="0" w:lastRowFirstColumn="0" w:lastRowLastColumn="0"/>
+            <w:tcW w:w="0" w:type="auto"/>
+            <w:tcMar/>
+          </w:tcPr>
+          <w:p>
+            <w:pPr>
+              <w:pStyle w:val="Compact"/>
+            </w:pPr>
+          </w:p>
+        </w:tc>
+        <w:tc>
+          <w:tcPr>
+            <w:cnfStyle w:val="000010000000" w:firstRow="0" w:lastRow="0" w:firstColumn="0" w:lastColumn="0" w:oddVBand="1" w:evenVBand="0" w:oddHBand="0" w:evenHBand="0" w:firstRowFirstColumn="0" w:firstRowLastColumn="0" w:lastRowFirstColumn="0" w:lastRowLastColumn="0"/>
+            <w:tcW w:w="0" w:type="auto"/>
+            <w:tcMar/>
+          </w:tcPr>
+          <w:p>
+            <w:pPr>
+              <w:pStyle w:val="Compact"/>
+            </w:pPr>
+          </w:p>
+        </w:tc>
+        <w:tc>
+          <w:tcPr>
+            <w:cnfStyle w:val="000001000000" w:firstRow="0" w:lastRow="0" w:firstColumn="0" w:lastColumn="0" w:oddVBand="0" w:evenVBand="1" w:oddHBand="0" w:evenHBand="0" w:firstRowFirstColumn="0" w:firstRowLastColumn="0" w:lastRowFirstColumn="0" w:lastRowLastColumn="0"/>
+            <w:tcW w:w="0" w:type="auto"/>
+            <w:tcMar/>
+          </w:tcPr>
+          <w:p>
+            <w:pPr>
+              <w:pStyle w:val="Compact"/>
+            </w:pPr>
+            <w:r>
+              <w:t>−0.</w:t>
+            </w:r>
+            <w:r>
+              <w:t>289</w:t>
+            </w:r>
+            <w:r>
+              <w:t xml:space="preserve"> (0.</w:t>
+            </w:r>
+            <w:r>
+              <w:t>661</w:t>
+            </w:r>
+            <w:r>
+              <w:t>)</w:t>
+            </w:r>
+          </w:p>
+        </w:tc>
+        <w:tc>
+          <w:tcPr>
+            <w:cnfStyle w:val="000010000000" w:firstRow="0" w:lastRow="0" w:firstColumn="0" w:lastColumn="0" w:oddVBand="1" w:evenVBand="0" w:oddHBand="0" w:evenHBand="0" w:firstRowFirstColumn="0" w:firstRowLastColumn="0" w:lastRowFirstColumn="0" w:lastRowLastColumn="0"/>
+            <w:tcW w:w="0" w:type="auto"/>
+            <w:tcMar/>
+          </w:tcPr>
+          <w:p>
+            <w:pPr>
+              <w:pStyle w:val="Compact"/>
+            </w:pPr>
+          </w:p>
+        </w:tc>
+        <w:tc>
+          <w:tcPr>
+            <w:cnfStyle w:val="000001000000" w:firstRow="0" w:lastRow="0" w:firstColumn="0" w:lastColumn="0" w:oddVBand="0" w:evenVBand="1" w:oddHBand="0" w:evenHBand="0" w:firstRowFirstColumn="0" w:firstRowLastColumn="0" w:lastRowFirstColumn="0" w:lastRowLastColumn="0"/>
+            <w:tcW w:w="0" w:type="auto"/>
+            <w:tcMar/>
           </w:tcPr>
           <w:p>
             <w:pPr>
@@ -3683,7 +4865,9 @@
         </w:trPr>
         <w:tc>
           <w:tcPr>
-            <w:tcW w:w="0" w:type="auto"/>
+            <w:cnfStyle w:val="000010000000" w:firstRow="0" w:lastRow="0" w:firstColumn="0" w:lastColumn="0" w:oddVBand="1" w:evenVBand="0" w:oddHBand="0" w:evenHBand="0" w:firstRowFirstColumn="0" w:firstRowLastColumn="0" w:lastRowFirstColumn="0" w:lastRowLastColumn="0"/>
+            <w:tcW w:w="0" w:type="auto"/>
+            <w:tcMar/>
           </w:tcPr>
           <w:p>
             <w:pPr>
@@ -3696,37 +4880,45 @@
         </w:tc>
         <w:tc>
           <w:tcPr>
-            <w:tcW w:w="0" w:type="auto"/>
-          </w:tcPr>
-          <w:p>
-            <w:pPr>
-              <w:pStyle w:val="Compact"/>
-            </w:pPr>
-          </w:p>
-        </w:tc>
-        <w:tc>
-          <w:tcPr>
-            <w:tcW w:w="0" w:type="auto"/>
-          </w:tcPr>
-          <w:p>
-            <w:pPr>
-              <w:pStyle w:val="Compact"/>
-            </w:pPr>
-          </w:p>
-        </w:tc>
-        <w:tc>
-          <w:tcPr>
-            <w:tcW w:w="0" w:type="auto"/>
-          </w:tcPr>
-          <w:p>
-            <w:pPr>
-              <w:pStyle w:val="Compact"/>
-            </w:pPr>
-          </w:p>
-        </w:tc>
-        <w:tc>
-          <w:tcPr>
-            <w:tcW w:w="0" w:type="auto"/>
+            <w:cnfStyle w:val="000001000000" w:firstRow="0" w:lastRow="0" w:firstColumn="0" w:lastColumn="0" w:oddVBand="0" w:evenVBand="1" w:oddHBand="0" w:evenHBand="0" w:firstRowFirstColumn="0" w:firstRowLastColumn="0" w:lastRowFirstColumn="0" w:lastRowLastColumn="0"/>
+            <w:tcW w:w="0" w:type="auto"/>
+            <w:tcMar/>
+          </w:tcPr>
+          <w:p>
+            <w:pPr>
+              <w:pStyle w:val="Compact"/>
+            </w:pPr>
+          </w:p>
+        </w:tc>
+        <w:tc>
+          <w:tcPr>
+            <w:cnfStyle w:val="000010000000" w:firstRow="0" w:lastRow="0" w:firstColumn="0" w:lastColumn="0" w:oddVBand="1" w:evenVBand="0" w:oddHBand="0" w:evenHBand="0" w:firstRowFirstColumn="0" w:firstRowLastColumn="0" w:lastRowFirstColumn="0" w:lastRowLastColumn="0"/>
+            <w:tcW w:w="0" w:type="auto"/>
+            <w:tcMar/>
+          </w:tcPr>
+          <w:p>
+            <w:pPr>
+              <w:pStyle w:val="Compact"/>
+            </w:pPr>
+          </w:p>
+        </w:tc>
+        <w:tc>
+          <w:tcPr>
+            <w:cnfStyle w:val="000001000000" w:firstRow="0" w:lastRow="0" w:firstColumn="0" w:lastColumn="0" w:oddVBand="0" w:evenVBand="1" w:oddHBand="0" w:evenHBand="0" w:firstRowFirstColumn="0" w:firstRowLastColumn="0" w:lastRowFirstColumn="0" w:lastRowLastColumn="0"/>
+            <w:tcW w:w="0" w:type="auto"/>
+            <w:tcMar/>
+          </w:tcPr>
+          <w:p>
+            <w:pPr>
+              <w:pStyle w:val="Compact"/>
+            </w:pPr>
+          </w:p>
+        </w:tc>
+        <w:tc>
+          <w:tcPr>
+            <w:cnfStyle w:val="000010000000" w:firstRow="0" w:lastRow="0" w:firstColumn="0" w:lastColumn="0" w:oddVBand="1" w:evenVBand="0" w:oddHBand="0" w:evenHBand="0" w:firstRowFirstColumn="0" w:firstRowLastColumn="0" w:lastRowFirstColumn="0" w:lastRowLastColumn="0"/>
+            <w:tcW w:w="0" w:type="auto"/>
+            <w:tcMar/>
           </w:tcPr>
           <w:p>
             <w:pPr>
@@ -3745,7 +4937,9 @@
         </w:tc>
         <w:tc>
           <w:tcPr>
-            <w:tcW w:w="0" w:type="auto"/>
+            <w:cnfStyle w:val="000001000000" w:firstRow="0" w:lastRow="0" w:firstColumn="0" w:lastColumn="0" w:oddVBand="0" w:evenVBand="1" w:oddHBand="0" w:evenHBand="0" w:firstRowFirstColumn="0" w:firstRowLastColumn="0" w:lastRowFirstColumn="0" w:lastRowLastColumn="0"/>
+            <w:tcW w:w="0" w:type="auto"/>
+            <w:tcMar/>
           </w:tcPr>
           <w:p>
             <w:pPr>
@@ -3769,7 +4963,9 @@
         </w:trPr>
         <w:tc>
           <w:tcPr>
-            <w:tcW w:w="0" w:type="auto"/>
+            <w:cnfStyle w:val="000010000000" w:firstRow="0" w:lastRow="0" w:firstColumn="0" w:lastColumn="0" w:oddVBand="1" w:evenVBand="0" w:oddHBand="0" w:evenHBand="0" w:firstRowFirstColumn="0" w:firstRowLastColumn="0" w:lastRowFirstColumn="0" w:lastRowLastColumn="0"/>
+            <w:tcW w:w="0" w:type="auto"/>
+            <w:tcMar/>
           </w:tcPr>
           <w:p>
             <w:pPr>
@@ -3782,37 +4978,45 @@
         </w:tc>
         <w:tc>
           <w:tcPr>
-            <w:tcW w:w="0" w:type="auto"/>
-          </w:tcPr>
-          <w:p>
-            <w:pPr>
-              <w:pStyle w:val="Compact"/>
-            </w:pPr>
-          </w:p>
-        </w:tc>
-        <w:tc>
-          <w:tcPr>
-            <w:tcW w:w="0" w:type="auto"/>
-          </w:tcPr>
-          <w:p>
-            <w:pPr>
-              <w:pStyle w:val="Compact"/>
-            </w:pPr>
-          </w:p>
-        </w:tc>
-        <w:tc>
-          <w:tcPr>
-            <w:tcW w:w="0" w:type="auto"/>
-          </w:tcPr>
-          <w:p>
-            <w:pPr>
-              <w:pStyle w:val="Compact"/>
-            </w:pPr>
-          </w:p>
-        </w:tc>
-        <w:tc>
-          <w:tcPr>
-            <w:tcW w:w="0" w:type="auto"/>
+            <w:cnfStyle w:val="000001000000" w:firstRow="0" w:lastRow="0" w:firstColumn="0" w:lastColumn="0" w:oddVBand="0" w:evenVBand="1" w:oddHBand="0" w:evenHBand="0" w:firstRowFirstColumn="0" w:firstRowLastColumn="0" w:lastRowFirstColumn="0" w:lastRowLastColumn="0"/>
+            <w:tcW w:w="0" w:type="auto"/>
+            <w:tcMar/>
+          </w:tcPr>
+          <w:p>
+            <w:pPr>
+              <w:pStyle w:val="Compact"/>
+            </w:pPr>
+          </w:p>
+        </w:tc>
+        <w:tc>
+          <w:tcPr>
+            <w:cnfStyle w:val="000010000000" w:firstRow="0" w:lastRow="0" w:firstColumn="0" w:lastColumn="0" w:oddVBand="1" w:evenVBand="0" w:oddHBand="0" w:evenHBand="0" w:firstRowFirstColumn="0" w:firstRowLastColumn="0" w:lastRowFirstColumn="0" w:lastRowLastColumn="0"/>
+            <w:tcW w:w="0" w:type="auto"/>
+            <w:tcMar/>
+          </w:tcPr>
+          <w:p>
+            <w:pPr>
+              <w:pStyle w:val="Compact"/>
+            </w:pPr>
+          </w:p>
+        </w:tc>
+        <w:tc>
+          <w:tcPr>
+            <w:cnfStyle w:val="000001000000" w:firstRow="0" w:lastRow="0" w:firstColumn="0" w:lastColumn="0" w:oddVBand="0" w:evenVBand="1" w:oddHBand="0" w:evenHBand="0" w:firstRowFirstColumn="0" w:firstRowLastColumn="0" w:lastRowFirstColumn="0" w:lastRowLastColumn="0"/>
+            <w:tcW w:w="0" w:type="auto"/>
+            <w:tcMar/>
+          </w:tcPr>
+          <w:p>
+            <w:pPr>
+              <w:pStyle w:val="Compact"/>
+            </w:pPr>
+          </w:p>
+        </w:tc>
+        <w:tc>
+          <w:tcPr>
+            <w:cnfStyle w:val="000010000000" w:firstRow="0" w:lastRow="0" w:firstColumn="0" w:lastColumn="0" w:oddVBand="1" w:evenVBand="0" w:oddHBand="0" w:evenHBand="0" w:firstRowFirstColumn="0" w:firstRowLastColumn="0" w:lastRowFirstColumn="0" w:lastRowLastColumn="0"/>
+            <w:tcW w:w="0" w:type="auto"/>
+            <w:tcMar/>
           </w:tcPr>
           <w:p>
             <w:pPr>
@@ -3837,7 +5041,9 @@
         </w:tc>
         <w:tc>
           <w:tcPr>
-            <w:tcW w:w="0" w:type="auto"/>
+            <w:cnfStyle w:val="000001000000" w:firstRow="0" w:lastRow="0" w:firstColumn="0" w:lastColumn="0" w:oddVBand="0" w:evenVBand="1" w:oddHBand="0" w:evenHBand="0" w:firstRowFirstColumn="0" w:firstRowLastColumn="0" w:lastRowFirstColumn="0" w:lastRowLastColumn="0"/>
+            <w:tcW w:w="0" w:type="auto"/>
+            <w:tcMar/>
           </w:tcPr>
           <w:p>
             <w:pPr>
@@ -3852,7 +5058,9 @@
         </w:trPr>
         <w:tc>
           <w:tcPr>
-            <w:tcW w:w="0" w:type="auto"/>
+            <w:cnfStyle w:val="000010000000" w:firstRow="0" w:lastRow="0" w:firstColumn="0" w:lastColumn="0" w:oddVBand="1" w:evenVBand="0" w:oddHBand="0" w:evenHBand="0" w:firstRowFirstColumn="0" w:firstRowLastColumn="0" w:lastRowFirstColumn="0" w:lastRowLastColumn="0"/>
+            <w:tcW w:w="0" w:type="auto"/>
+            <w:tcMar/>
           </w:tcPr>
           <w:p>
             <w:pPr>
@@ -3865,47 +5073,57 @@
         </w:tc>
         <w:tc>
           <w:tcPr>
-            <w:tcW w:w="0" w:type="auto"/>
-          </w:tcPr>
-          <w:p>
-            <w:pPr>
-              <w:pStyle w:val="Compact"/>
-            </w:pPr>
-          </w:p>
-        </w:tc>
-        <w:tc>
-          <w:tcPr>
-            <w:tcW w:w="0" w:type="auto"/>
-          </w:tcPr>
-          <w:p>
-            <w:pPr>
-              <w:pStyle w:val="Compact"/>
-            </w:pPr>
-          </w:p>
-        </w:tc>
-        <w:tc>
-          <w:tcPr>
-            <w:tcW w:w="0" w:type="auto"/>
-          </w:tcPr>
-          <w:p>
-            <w:pPr>
-              <w:pStyle w:val="Compact"/>
-            </w:pPr>
-          </w:p>
-        </w:tc>
-        <w:tc>
-          <w:tcPr>
-            <w:tcW w:w="0" w:type="auto"/>
-          </w:tcPr>
-          <w:p>
-            <w:pPr>
-              <w:pStyle w:val="Compact"/>
-            </w:pPr>
-          </w:p>
-        </w:tc>
-        <w:tc>
-          <w:tcPr>
-            <w:tcW w:w="0" w:type="auto"/>
+            <w:cnfStyle w:val="000001000000" w:firstRow="0" w:lastRow="0" w:firstColumn="0" w:lastColumn="0" w:oddVBand="0" w:evenVBand="1" w:oddHBand="0" w:evenHBand="0" w:firstRowFirstColumn="0" w:firstRowLastColumn="0" w:lastRowFirstColumn="0" w:lastRowLastColumn="0"/>
+            <w:tcW w:w="0" w:type="auto"/>
+            <w:tcMar/>
+          </w:tcPr>
+          <w:p>
+            <w:pPr>
+              <w:pStyle w:val="Compact"/>
+            </w:pPr>
+          </w:p>
+        </w:tc>
+        <w:tc>
+          <w:tcPr>
+            <w:cnfStyle w:val="000010000000" w:firstRow="0" w:lastRow="0" w:firstColumn="0" w:lastColumn="0" w:oddVBand="1" w:evenVBand="0" w:oddHBand="0" w:evenHBand="0" w:firstRowFirstColumn="0" w:firstRowLastColumn="0" w:lastRowFirstColumn="0" w:lastRowLastColumn="0"/>
+            <w:tcW w:w="0" w:type="auto"/>
+            <w:tcMar/>
+          </w:tcPr>
+          <w:p>
+            <w:pPr>
+              <w:pStyle w:val="Compact"/>
+            </w:pPr>
+          </w:p>
+        </w:tc>
+        <w:tc>
+          <w:tcPr>
+            <w:cnfStyle w:val="000001000000" w:firstRow="0" w:lastRow="0" w:firstColumn="0" w:lastColumn="0" w:oddVBand="0" w:evenVBand="1" w:oddHBand="0" w:evenHBand="0" w:firstRowFirstColumn="0" w:firstRowLastColumn="0" w:lastRowFirstColumn="0" w:lastRowLastColumn="0"/>
+            <w:tcW w:w="0" w:type="auto"/>
+            <w:tcMar/>
+          </w:tcPr>
+          <w:p>
+            <w:pPr>
+              <w:pStyle w:val="Compact"/>
+            </w:pPr>
+          </w:p>
+        </w:tc>
+        <w:tc>
+          <w:tcPr>
+            <w:cnfStyle w:val="000010000000" w:firstRow="0" w:lastRow="0" w:firstColumn="0" w:lastColumn="0" w:oddVBand="1" w:evenVBand="0" w:oddHBand="0" w:evenHBand="0" w:firstRowFirstColumn="0" w:firstRowLastColumn="0" w:lastRowFirstColumn="0" w:lastRowLastColumn="0"/>
+            <w:tcW w:w="0" w:type="auto"/>
+            <w:tcMar/>
+          </w:tcPr>
+          <w:p>
+            <w:pPr>
+              <w:pStyle w:val="Compact"/>
+            </w:pPr>
+          </w:p>
+        </w:tc>
+        <w:tc>
+          <w:tcPr>
+            <w:cnfStyle w:val="000001000000" w:firstRow="0" w:lastRow="0" w:firstColumn="0" w:lastColumn="0" w:oddVBand="0" w:evenVBand="1" w:oddHBand="0" w:evenHBand="0" w:firstRowFirstColumn="0" w:firstRowLastColumn="0" w:lastRowFirstColumn="0" w:lastRowLastColumn="0"/>
+            <w:tcW w:w="0" w:type="auto"/>
+            <w:tcMar/>
           </w:tcPr>
           <w:p>
             <w:pPr>
@@ -3918,7 +5136,13 @@
               <w:t>49</w:t>
             </w:r>
             <w:r>
-              <w:t>*** (0.066)</w:t>
+              <w:t>*** (0.06</w:t>
+            </w:r>
+            <w:r>
+              <w:t>4</w:t>
+            </w:r>
+            <w:r>
+              <w:t>)</w:t>
             </w:r>
           </w:p>
         </w:tc>
@@ -3929,7 +5153,9 @@
         </w:trPr>
         <w:tc>
           <w:tcPr>
-            <w:tcW w:w="0" w:type="auto"/>
+            <w:cnfStyle w:val="000010000000" w:firstRow="0" w:lastRow="0" w:firstColumn="0" w:lastColumn="0" w:oddVBand="1" w:evenVBand="0" w:oddHBand="0" w:evenHBand="0" w:firstRowFirstColumn="0" w:firstRowLastColumn="0" w:lastRowFirstColumn="0" w:lastRowLastColumn="0"/>
+            <w:tcW w:w="0" w:type="auto"/>
+            <w:tcMar/>
           </w:tcPr>
           <w:p>
             <w:pPr>
@@ -3942,7 +5168,9 @@
         </w:tc>
         <w:tc>
           <w:tcPr>
-            <w:tcW w:w="0" w:type="auto"/>
+            <w:cnfStyle w:val="000001000000" w:firstRow="0" w:lastRow="0" w:firstColumn="0" w:lastColumn="0" w:oddVBand="0" w:evenVBand="1" w:oddHBand="0" w:evenHBand="0" w:firstRowFirstColumn="0" w:firstRowLastColumn="0" w:lastRowFirstColumn="0" w:lastRowLastColumn="0"/>
+            <w:tcW w:w="0" w:type="auto"/>
+            <w:tcMar/>
           </w:tcPr>
           <w:p>
             <w:pPr>
@@ -3955,7 +5183,9 @@
         </w:tc>
         <w:tc>
           <w:tcPr>
-            <w:tcW w:w="0" w:type="auto"/>
+            <w:cnfStyle w:val="000010000000" w:firstRow="0" w:lastRow="0" w:firstColumn="0" w:lastColumn="0" w:oddVBand="1" w:evenVBand="0" w:oddHBand="0" w:evenHBand="0" w:firstRowFirstColumn="0" w:firstRowLastColumn="0" w:lastRowFirstColumn="0" w:lastRowLastColumn="0"/>
+            <w:tcW w:w="0" w:type="auto"/>
+            <w:tcMar/>
           </w:tcPr>
           <w:p>
             <w:pPr>
@@ -3968,7 +5198,9 @@
         </w:tc>
         <w:tc>
           <w:tcPr>
-            <w:tcW w:w="0" w:type="auto"/>
+            <w:cnfStyle w:val="000001000000" w:firstRow="0" w:lastRow="0" w:firstColumn="0" w:lastColumn="0" w:oddVBand="0" w:evenVBand="1" w:oddHBand="0" w:evenHBand="0" w:firstRowFirstColumn="0" w:firstRowLastColumn="0" w:lastRowFirstColumn="0" w:lastRowLastColumn="0"/>
+            <w:tcW w:w="0" w:type="auto"/>
+            <w:tcMar/>
           </w:tcPr>
           <w:p>
             <w:pPr>
@@ -3981,7 +5213,9 @@
         </w:tc>
         <w:tc>
           <w:tcPr>
-            <w:tcW w:w="0" w:type="auto"/>
+            <w:cnfStyle w:val="000010000000" w:firstRow="0" w:lastRow="0" w:firstColumn="0" w:lastColumn="0" w:oddVBand="1" w:evenVBand="0" w:oddHBand="0" w:evenHBand="0" w:firstRowFirstColumn="0" w:firstRowLastColumn="0" w:lastRowFirstColumn="0" w:lastRowLastColumn="0"/>
+            <w:tcW w:w="0" w:type="auto"/>
+            <w:tcMar/>
           </w:tcPr>
           <w:p>
             <w:pPr>
@@ -3994,7 +5228,9 @@
         </w:tc>
         <w:tc>
           <w:tcPr>
-            <w:tcW w:w="0" w:type="auto"/>
+            <w:cnfStyle w:val="000001000000" w:firstRow="0" w:lastRow="0" w:firstColumn="0" w:lastColumn="0" w:oddVBand="0" w:evenVBand="1" w:oddHBand="0" w:evenHBand="0" w:firstRowFirstColumn="0" w:firstRowLastColumn="0" w:lastRowFirstColumn="0" w:lastRowLastColumn="0"/>
+            <w:tcW w:w="0" w:type="auto"/>
+            <w:tcMar/>
           </w:tcPr>
           <w:p>
             <w:pPr>
@@ -5281,7 +6517,7 @@
         <w:pStyle w:val="Heading3"/>
         <w:jc w:val="both"/>
       </w:pPr>
-      <w:bookmarkStart w:id="17" w:name="splitting-by-direction"/>
+      <w:bookmarkStart w:name="splitting-by-direction" w:id="17"/>
       <w:bookmarkEnd w:id="16"/>
       <w:r>
         <w:t>5.3 Splitting by Direction</w:t>
@@ -5311,16 +6547,42 @@
         <w:jc w:val="both"/>
       </w:pPr>
       <w:r>
-        <w:t>A share-form robustness check on the same two directions (Table 10, Supporting Information) tells a different story. Holding the EU component of the denominator fixed, ACP exports to the EU stay indistinguishable from zero at +1.212 (SE 0.969), while EU exports to ACP markets carry a significant negative coefficient of −1.554 (SE 0.429). A second construction, built from each direction’s own ex-EU trade flows only, reproduces the same split: ACP exports insignificant at +0.359 (SE 0.349), EU exports significant at −1.180 (SE 0.261). Both constructions keep the share form’s ratio structure rather than estimating components directly, so unlike the side-matched rows above, they still inherit the denominator problem documented in Section 5.2, and the asymmetry runs the opposite way from before: there, the ACP-exports direction carried the detectable positive relationship, while here it is the EU-exports direction that stays significant.</w:t>
-      </w:r>
-    </w:p>
-    <w:p>
-      <w:pPr>
-        <w:pStyle w:val="BodyText"/>
-        <w:jc w:val="both"/>
-      </w:pPr>
-      <w:r>
-        <w:t>Taken together, these four directional checks, side-matched components, the EU-fixed share, and the direction-matched ex-EU share, all point to the same conclusion about the pooled result: the naive pooled share form in Table 5 overstates diversion in both directions. They do not settle, however, which direction, if either, carries a genuine residual relationship once the ratio’s mechanics are addressed. This paper treats that directional asymmetry as an open question, unlike the pooled null, which the evidence above resolves.</w:t>
+        <w:rPr/>
+        <w:t>A share-form robustness check on the same two directions (Table 10, Supporting Information) tells a different story. Holding the EU component of the denominator fixed, ACP exports to the EU stay indistinguishable from zero at +1.212 (SE 0.969), while EU exports to ACP markets carry a significant negative coefficient of −1.554 (SE 0.429). A second construction, built from each direction's own ex-EU trade flows only, reproduces the same split: ACP exports insignificant at +0.359 (SE 0.349), EU exports significant at −1.180 (SE 0.261). Both constructions keep the share form's ratio structure rather than estimating components directly, so unlike the side-matched rows above, they still inherit the denominator problem documented in Section 5.2, and the asymmetry runs the opposite way from before: there, the ACP-exports direction carried the detectable positive relationship, while here it is the EU-exports direction that stays significant. Because the side-matched test separates non-overlapping components, while the EU-fixed and direction-matched ex-EU shares remain ratio constructions with residual denominator dependence, the two do not carry equal weight. The ACP-exports finding from the side-matched test is the better-grounded of the two directional results.</w:t>
+      </w:r>
+    </w:p>
+    <w:p>
+      <w:pPr>
+        <w:pStyle w:val="BodyText"/>
+        <w:jc w:val="both"/>
+      </w:pPr>
+      <w:r>
+        <w:rPr/>
+        <w:t xml:space="preserve">Taken together, these four directional checks — side-matched components, the EU-fixed share, and the direction-matched ex-EU share — point to the same conclusion about the pooled result. The naive pooled share form in Table 5 overstates diversion in both directions. They do not settle, however, which direction, if either, </w:t>
+      </w:r>
+      <w:r>
+        <w:rPr/>
+        <w:t>carries a genuine residual relationship</w:t>
+      </w:r>
+      <w:r>
+        <w:rPr/>
+        <w:t xml:space="preserve"> once the </w:t>
+      </w:r>
+      <w:r>
+        <w:rPr/>
+        <w:t>ratio's</w:t>
+      </w:r>
+      <w:r>
+        <w:rPr/>
+        <w:t xml:space="preserve"> mechanics are addressed. This paper treats the </w:t>
+      </w:r>
+      <w:r>
+        <w:rPr/>
+        <w:t>magnitude</w:t>
+      </w:r>
+      <w:r>
+        <w:rPr/>
+        <w:t xml:space="preserve"> and cause of that asymmetry as an open question, unlike the pooled null, which the evidence above resolves.</w:t>
       </w:r>
     </w:p>
     <w:p>
@@ -5328,7 +6590,7 @@
         <w:pStyle w:val="Heading3"/>
         <w:jc w:val="both"/>
       </w:pPr>
-      <w:bookmarkStart w:id="18" w:name="X65ef8721c9d22eebce0dbbfbb92c71218e38553"/>
+      <w:bookmarkStart w:name="X65ef8721c9d22eebce0dbbfbb92c71218e38553" w:id="18"/>
       <w:bookmarkEnd w:id="17"/>
       <w:r>
         <w:t>5.4 Regional Groupings and Economic Partnership Agreements</w:t>
@@ -5991,7 +7253,7 @@
               <w:pStyle w:val="Compact"/>
             </w:pPr>
             <w:r>
-              <w:t>−</w:t>
+              <w:t>+</w:t>
             </w:r>
             <w:r>
               <w:t>3.098***</w:t>
@@ -6276,7 +7538,7 @@
         <w:pStyle w:val="Heading3"/>
         <w:jc w:val="both"/>
       </w:pPr>
-      <w:bookmarkStart w:id="19" w:name="robustness-checks"/>
+      <w:bookmarkStart w:name="robustness-checks" w:id="19"/>
       <w:bookmarkEnd w:id="18"/>
       <w:r>
         <w:t>5.5 Robustness Checks</w:t>
@@ -6404,7 +7666,7 @@
         <w:pStyle w:val="Heading2"/>
         <w:jc w:val="both"/>
       </w:pPr>
-      <w:bookmarkStart w:id="20" w:name="conclusion"/>
+      <w:bookmarkStart w:name="conclusion" w:id="20"/>
       <w:bookmarkEnd w:id="14"/>
       <w:bookmarkEnd w:id="19"/>
       <w:r>
@@ -6488,7 +7750,7 @@
         <w:pStyle w:val="Heading2"/>
         <w:jc w:val="both"/>
       </w:pPr>
-      <w:bookmarkStart w:id="21" w:name="supporting-information"/>
+      <w:bookmarkStart w:name="supporting-information" w:id="21"/>
       <w:bookmarkEnd w:id="20"/>
       <w:r>
         <w:t>Supporting Information</w:t>
@@ -6508,7 +7770,7 @@
         <w:pStyle w:val="Heading2"/>
         <w:jc w:val="both"/>
       </w:pPr>
-      <w:bookmarkStart w:id="22" w:name="references"/>
+      <w:bookmarkStart w:name="references" w:id="22"/>
       <w:bookmarkEnd w:id="21"/>
       <w:r>
         <w:t>References</w:t>
@@ -6999,7 +8261,7 @@
       <w:bookmarkEnd w:id="22"/>
     </w:p>
     <w:sectPr>
-      <w:pgSz w:w="12240" w:h="15840"/>
+      <w:pgSz w:w="12240" w:h="15840" w:orient="portrait"/>
       <w:pgMar w:top="1440" w:right="1440" w:bottom="1440" w:left="1440" w:header="720" w:footer="720" w:gutter="0"/>
       <w:cols w:space="720"/>
     </w:sectPr>
@@ -7141,7 +8403,7 @@
   <w:docDefaults>
     <w:rPrDefault>
       <w:rPr>
-        <w:rFonts w:asciiTheme="minorHAnsi" w:eastAsiaTheme="minorHAnsi" w:hAnsiTheme="minorHAnsi" w:cstheme="minorBidi"/>
+        <w:rFonts w:asciiTheme="minorHAnsi" w:hAnsiTheme="minorHAnsi" w:eastAsiaTheme="minorHAnsi" w:cstheme="minorBidi"/>
         <w:sz w:val="24"/>
         <w:szCs w:val="24"/>
         <w:lang w:val="en-US" w:eastAsia="en-US" w:bidi="ar-SA"/>
@@ -7391,13 +8653,13 @@
     <w:lsdException w:name="List Table 5 Dark Accent 6" w:uiPriority="50"/>
     <w:lsdException w:name="List Table 6 Colorful Accent 6" w:uiPriority="51"/>
     <w:lsdException w:name="List Table 7 Colorful Accent 6" w:uiPriority="52"/>
-    <w:lsdException w:name="Mention" w:semiHidden="1" w:uiPriority="99" w:unhideWhenUsed="1"/>
-    <w:lsdException w:name="Smart Hyperlink" w:semiHidden="1" w:uiPriority="99" w:unhideWhenUsed="1"/>
-    <w:lsdException w:name="Hashtag" w:semiHidden="1" w:uiPriority="99" w:unhideWhenUsed="1"/>
-    <w:lsdException w:name="Unresolved Mention" w:semiHidden="1" w:uiPriority="99" w:unhideWhenUsed="1"/>
-    <w:lsdException w:name="Smart Link" w:semiHidden="1" w:uiPriority="99" w:unhideWhenUsed="1"/>
+    <w:lsdException w:name="Mention" w:uiPriority="99" w:semiHidden="1" w:unhideWhenUsed="1"/>
+    <w:lsdException w:name="Smart Hyperlink" w:uiPriority="99" w:semiHidden="1" w:unhideWhenUsed="1"/>
+    <w:lsdException w:name="Hashtag" w:uiPriority="99" w:semiHidden="1" w:unhideWhenUsed="1"/>
+    <w:lsdException w:name="Unresolved Mention" w:uiPriority="99" w:semiHidden="1" w:unhideWhenUsed="1"/>
+    <w:lsdException w:name="Smart Link" w:uiPriority="99" w:semiHidden="1" w:unhideWhenUsed="1"/>
   </w:latentStyles>
-  <w:style w:type="paragraph" w:default="1" w:styleId="Normal">
+  <w:style w:type="paragraph" w:styleId="Normal" w:default="1">
     <w:name w:val="Normal"/>
     <w:qFormat/>
   </w:style>
@@ -7414,7 +8676,7 @@
       <w:outlineLvl w:val="0"/>
     </w:pPr>
     <w:rPr>
-      <w:rFonts w:asciiTheme="majorHAnsi" w:eastAsiaTheme="majorEastAsia" w:hAnsiTheme="majorHAnsi" w:cstheme="majorBidi"/>
+      <w:rFonts w:asciiTheme="majorHAnsi" w:hAnsiTheme="majorHAnsi" w:eastAsiaTheme="majorEastAsia" w:cstheme="majorBidi"/>
       <w:b/>
       <w:bCs/>
       <w:color w:val="000000"/>
@@ -7436,7 +8698,7 @@
       <w:outlineLvl w:val="1"/>
     </w:pPr>
     <w:rPr>
-      <w:rFonts w:asciiTheme="majorHAnsi" w:eastAsiaTheme="majorEastAsia" w:hAnsiTheme="majorHAnsi" w:cstheme="majorBidi"/>
+      <w:rFonts w:asciiTheme="majorHAnsi" w:hAnsiTheme="majorHAnsi" w:eastAsiaTheme="majorEastAsia" w:cstheme="majorBidi"/>
       <w:b/>
       <w:bCs/>
       <w:color w:val="000000"/>
@@ -7458,7 +8720,7 @@
       <w:outlineLvl w:val="2"/>
     </w:pPr>
     <w:rPr>
-      <w:rFonts w:asciiTheme="majorHAnsi" w:eastAsiaTheme="majorEastAsia" w:hAnsiTheme="majorHAnsi" w:cstheme="majorBidi"/>
+      <w:rFonts w:asciiTheme="majorHAnsi" w:hAnsiTheme="majorHAnsi" w:eastAsiaTheme="majorEastAsia" w:cstheme="majorBidi"/>
       <w:b/>
       <w:bCs/>
       <w:color w:val="000000"/>
@@ -7478,7 +8740,7 @@
       <w:outlineLvl w:val="3"/>
     </w:pPr>
     <w:rPr>
-      <w:rFonts w:asciiTheme="majorHAnsi" w:eastAsiaTheme="majorEastAsia" w:hAnsiTheme="majorHAnsi" w:cstheme="majorBidi"/>
+      <w:rFonts w:asciiTheme="majorHAnsi" w:hAnsiTheme="majorHAnsi" w:eastAsiaTheme="majorEastAsia" w:cstheme="majorBidi"/>
       <w:bCs/>
       <w:i/>
       <w:color w:val="000000"/>
@@ -7498,7 +8760,7 @@
       <w:outlineLvl w:val="4"/>
     </w:pPr>
     <w:rPr>
-      <w:rFonts w:asciiTheme="majorHAnsi" w:eastAsiaTheme="majorEastAsia" w:hAnsiTheme="majorHAnsi" w:cstheme="majorBidi"/>
+      <w:rFonts w:asciiTheme="majorHAnsi" w:hAnsiTheme="majorHAnsi" w:eastAsiaTheme="majorEastAsia" w:cstheme="majorBidi"/>
       <w:iCs/>
       <w:color w:val="000000"/>
     </w:rPr>
@@ -7517,7 +8779,7 @@
       <w:outlineLvl w:val="5"/>
     </w:pPr>
     <w:rPr>
-      <w:rFonts w:asciiTheme="majorHAnsi" w:eastAsiaTheme="majorEastAsia" w:hAnsiTheme="majorHAnsi" w:cstheme="majorBidi"/>
+      <w:rFonts w:asciiTheme="majorHAnsi" w:hAnsiTheme="majorHAnsi" w:eastAsiaTheme="majorEastAsia" w:cstheme="majorBidi"/>
       <w:color w:val="000000"/>
     </w:rPr>
   </w:style>
@@ -7535,7 +8797,7 @@
       <w:outlineLvl w:val="6"/>
     </w:pPr>
     <w:rPr>
-      <w:rFonts w:asciiTheme="majorHAnsi" w:eastAsiaTheme="majorEastAsia" w:hAnsiTheme="majorHAnsi" w:cstheme="majorBidi"/>
+      <w:rFonts w:asciiTheme="majorHAnsi" w:hAnsiTheme="majorHAnsi" w:eastAsiaTheme="majorEastAsia" w:cstheme="majorBidi"/>
       <w:color w:val="000000"/>
     </w:rPr>
   </w:style>
@@ -7553,7 +8815,7 @@
       <w:outlineLvl w:val="7"/>
     </w:pPr>
     <w:rPr>
-      <w:rFonts w:asciiTheme="majorHAnsi" w:eastAsiaTheme="majorEastAsia" w:hAnsiTheme="majorHAnsi" w:cstheme="majorBidi"/>
+      <w:rFonts w:asciiTheme="majorHAnsi" w:hAnsiTheme="majorHAnsi" w:eastAsiaTheme="majorEastAsia" w:cstheme="majorBidi"/>
       <w:color w:val="000000"/>
     </w:rPr>
   </w:style>
@@ -7571,17 +8833,17 @@
       <w:outlineLvl w:val="8"/>
     </w:pPr>
     <w:rPr>
-      <w:rFonts w:asciiTheme="majorHAnsi" w:eastAsiaTheme="majorEastAsia" w:hAnsiTheme="majorHAnsi" w:cstheme="majorBidi"/>
+      <w:rFonts w:asciiTheme="majorHAnsi" w:hAnsiTheme="majorHAnsi" w:eastAsiaTheme="majorEastAsia" w:cstheme="majorBidi"/>
       <w:color w:val="000000"/>
     </w:rPr>
   </w:style>
-  <w:style w:type="character" w:default="1" w:styleId="DefaultParagraphFont">
+  <w:style w:type="character" w:styleId="DefaultParagraphFont" w:default="1">
     <w:name w:val="Default Paragraph Font"/>
     <w:uiPriority w:val="1"/>
     <w:semiHidden/>
     <w:unhideWhenUsed/>
   </w:style>
-  <w:style w:type="table" w:default="1" w:styleId="TableNormal">
+  <w:style w:type="table" w:styleId="TableNormal" w:default="1">
     <w:name w:val="Normal Table"/>
     <w:uiPriority w:val="99"/>
     <w:semiHidden/>
@@ -7596,7 +8858,7 @@
       </w:tblCellMar>
     </w:tblPr>
   </w:style>
-  <w:style w:type="numbering" w:default="1" w:styleId="NoList">
+  <w:style w:type="numbering" w:styleId="NoList" w:default="1">
     <w:name w:val="No List"/>
     <w:uiPriority w:val="99"/>
     <w:semiHidden/>
@@ -7610,13 +8872,13 @@
       <w:spacing w:before="180" w:after="180"/>
     </w:pPr>
   </w:style>
-  <w:style w:type="paragraph" w:customStyle="1" w:styleId="FirstParagraph">
+  <w:style w:type="paragraph" w:styleId="FirstParagraph" w:customStyle="1">
     <w:name w:val="First Paragraph"/>
     <w:basedOn w:val="BodyText"/>
     <w:next w:val="BodyText"/>
     <w:qFormat/>
   </w:style>
-  <w:style w:type="paragraph" w:customStyle="1" w:styleId="Compact">
+  <w:style w:type="paragraph" w:styleId="Compact" w:customStyle="1">
     <w:name w:val="Compact"/>
     <w:basedOn w:val="BodyText"/>
     <w:qFormat/>
@@ -7636,7 +8898,7 @@
       <w:jc w:val="center"/>
     </w:pPr>
     <w:rPr>
-      <w:rFonts w:asciiTheme="majorHAnsi" w:eastAsiaTheme="majorEastAsia" w:hAnsiTheme="majorHAnsi" w:cstheme="majorBidi"/>
+      <w:rFonts w:asciiTheme="majorHAnsi" w:hAnsiTheme="majorHAnsi" w:eastAsiaTheme="majorEastAsia" w:cstheme="majorBidi"/>
       <w:b/>
       <w:bCs/>
       <w:color w:val="000000"/>
@@ -7657,7 +8919,7 @@
       <w:szCs w:val="30"/>
     </w:rPr>
   </w:style>
-  <w:style w:type="paragraph" w:customStyle="1" w:styleId="Author">
+  <w:style w:type="paragraph" w:styleId="Author" w:customStyle="1">
     <w:name w:val="Author"/>
     <w:next w:val="BodyText"/>
     <w:qFormat/>
@@ -7677,7 +8939,7 @@
       <w:jc w:val="center"/>
     </w:pPr>
   </w:style>
-  <w:style w:type="paragraph" w:customStyle="1" w:styleId="AbstractTitle">
+  <w:style w:type="paragraph" w:styleId="AbstractTitle" w:customStyle="1">
     <w:name w:val="Abstract Title"/>
     <w:basedOn w:val="Normal"/>
     <w:next w:val="Abstract"/>
@@ -7695,7 +8957,7 @@
       <w:szCs w:val="20"/>
     </w:rPr>
   </w:style>
-  <w:style w:type="paragraph" w:customStyle="1" w:styleId="Abstract">
+  <w:style w:type="paragraph" w:styleId="Abstract" w:customStyle="1">
     <w:name w:val="Abstract"/>
     <w:basedOn w:val="Normal"/>
     <w:next w:val="BodyText"/>
@@ -7734,7 +8996,7 @@
     <w:unhideWhenUsed/>
     <w:qFormat/>
   </w:style>
-  <w:style w:type="table" w:customStyle="1" w:styleId="Table">
+  <w:style w:type="table" w:styleId="Table" w:customStyle="1">
     <w:name w:val="Table"/>
     <w:semiHidden/>
     <w:unhideWhenUsed/>
@@ -7757,13 +9019,13 @@
       </w:trPr>
       <w:tcPr>
         <w:tcBorders>
-          <w:bottom w:val="single" w:sz="0" w:space="0" w:color="auto"/>
+          <w:bottom w:val="single" w:color="auto" w:sz="0" w:space="0"/>
         </w:tcBorders>
         <w:vAlign w:val="bottom"/>
       </w:tcPr>
     </w:tblStylePr>
   </w:style>
-  <w:style w:type="paragraph" w:customStyle="1" w:styleId="DefinitionTerm">
+  <w:style w:type="paragraph" w:styleId="DefinitionTerm" w:customStyle="1">
     <w:name w:val="Definition Term"/>
     <w:basedOn w:val="Normal"/>
     <w:next w:val="Definition"/>
@@ -7776,7 +9038,7 @@
       <w:b/>
     </w:rPr>
   </w:style>
-  <w:style w:type="paragraph" w:customStyle="1" w:styleId="Definition">
+  <w:style w:type="paragraph" w:styleId="Definition" w:customStyle="1">
     <w:name w:val="Definition"/>
     <w:basedOn w:val="Normal"/>
   </w:style>
@@ -7791,34 +9053,34 @@
       <w:i/>
     </w:rPr>
   </w:style>
-  <w:style w:type="paragraph" w:customStyle="1" w:styleId="TableCaption">
+  <w:style w:type="paragraph" w:styleId="TableCaption" w:customStyle="1">
     <w:name w:val="Table Caption"/>
     <w:basedOn w:val="Caption"/>
     <w:pPr>
       <w:keepNext/>
     </w:pPr>
   </w:style>
-  <w:style w:type="paragraph" w:customStyle="1" w:styleId="ImageCaption">
+  <w:style w:type="paragraph" w:styleId="ImageCaption" w:customStyle="1">
     <w:name w:val="Image Caption"/>
     <w:basedOn w:val="Caption"/>
   </w:style>
-  <w:style w:type="paragraph" w:customStyle="1" w:styleId="Figure">
+  <w:style w:type="paragraph" w:styleId="Figure" w:customStyle="1">
     <w:name w:val="Figure"/>
     <w:basedOn w:val="Normal"/>
   </w:style>
-  <w:style w:type="paragraph" w:customStyle="1" w:styleId="CaptionedFigure">
+  <w:style w:type="paragraph" w:styleId="CaptionedFigure" w:customStyle="1">
     <w:name w:val="Captioned Figure"/>
     <w:basedOn w:val="Figure"/>
     <w:pPr>
       <w:keepNext/>
     </w:pPr>
   </w:style>
-  <w:style w:type="character" w:customStyle="1" w:styleId="CaptionChar">
+  <w:style w:type="character" w:styleId="CaptionChar" w:customStyle="1">
     <w:name w:val="Caption Char"/>
     <w:basedOn w:val="DefaultParagraphFont"/>
     <w:link w:val="Caption"/>
   </w:style>
-  <w:style w:type="character" w:customStyle="1" w:styleId="VerbatimChar">
+  <w:style w:type="character" w:styleId="VerbatimChar" w:customStyle="1">
     <w:name w:val="Verbatim Char"/>
     <w:basedOn w:val="CaptionChar"/>
     <w:link w:val="SourceCode"/>
@@ -7827,7 +9089,7 @@
       <w:sz w:val="22"/>
     </w:rPr>
   </w:style>
-  <w:style w:type="character" w:customStyle="1" w:styleId="SectionNumber">
+  <w:style w:type="character" w:styleId="SectionNumber" w:customStyle="1">
     <w:name w:val="Section Number"/>
     <w:basedOn w:val="CaptionChar"/>
   </w:style>
@@ -7861,7 +9123,7 @@
       <w:bCs w:val="0"/>
     </w:rPr>
   </w:style>
-  <w:style w:type="paragraph" w:customStyle="1" w:styleId="SourceCode">
+  <w:style w:type="paragraph" w:styleId="SourceCode" w:customStyle="1">
     <w:name w:val="Source Code"/>
     <w:basedOn w:val="Normal"/>
     <w:link w:val="VerbatimChar"/>
@@ -7869,7 +9131,7 @@
       <w:wordWrap w:val="0"/>
     </w:pPr>
   </w:style>
-  <w:style w:type="character" w:customStyle="1" w:styleId="KeywordTok">
+  <w:style w:type="character" w:styleId="KeywordTok" w:customStyle="1">
     <w:name w:val="KeywordTok"/>
     <w:basedOn w:val="VerbatimChar"/>
     <w:rPr>
@@ -7879,7 +9141,7 @@
       <w:sz w:val="22"/>
     </w:rPr>
   </w:style>
-  <w:style w:type="character" w:customStyle="1" w:styleId="DataTypeTok">
+  <w:style w:type="character" w:styleId="DataTypeTok" w:customStyle="1">
     <w:name w:val="DataTypeTok"/>
     <w:basedOn w:val="VerbatimChar"/>
     <w:rPr>
@@ -7888,7 +9150,7 @@
       <w:sz w:val="22"/>
     </w:rPr>
   </w:style>
-  <w:style w:type="character" w:customStyle="1" w:styleId="DecValTok">
+  <w:style w:type="character" w:styleId="DecValTok" w:customStyle="1">
     <w:name w:val="DecValTok"/>
     <w:basedOn w:val="VerbatimChar"/>
     <w:rPr>
@@ -7897,7 +9159,7 @@
       <w:sz w:val="22"/>
     </w:rPr>
   </w:style>
-  <w:style w:type="character" w:customStyle="1" w:styleId="BaseNTok">
+  <w:style w:type="character" w:styleId="BaseNTok" w:customStyle="1">
     <w:name w:val="BaseNTok"/>
     <w:basedOn w:val="VerbatimChar"/>
     <w:rPr>
@@ -7906,7 +9168,7 @@
       <w:sz w:val="22"/>
     </w:rPr>
   </w:style>
-  <w:style w:type="character" w:customStyle="1" w:styleId="FloatTok">
+  <w:style w:type="character" w:styleId="FloatTok" w:customStyle="1">
     <w:name w:val="FloatTok"/>
     <w:basedOn w:val="VerbatimChar"/>
     <w:rPr>
@@ -7915,7 +9177,7 @@
       <w:sz w:val="22"/>
     </w:rPr>
   </w:style>
-  <w:style w:type="character" w:customStyle="1" w:styleId="ConstantTok">
+  <w:style w:type="character" w:styleId="ConstantTok" w:customStyle="1">
     <w:name w:val="ConstantTok"/>
     <w:basedOn w:val="VerbatimChar"/>
     <w:rPr>
@@ -7924,7 +9186,7 @@
       <w:sz w:val="22"/>
     </w:rPr>
   </w:style>
-  <w:style w:type="character" w:customStyle="1" w:styleId="CharTok">
+  <w:style w:type="character" w:styleId="CharTok" w:customStyle="1">
     <w:name w:val="CharTok"/>
     <w:basedOn w:val="VerbatimChar"/>
     <w:rPr>
@@ -7933,7 +9195,7 @@
       <w:sz w:val="22"/>
     </w:rPr>
   </w:style>
-  <w:style w:type="character" w:customStyle="1" w:styleId="SpecialCharTok">
+  <w:style w:type="character" w:styleId="SpecialCharTok" w:customStyle="1">
     <w:name w:val="SpecialCharTok"/>
     <w:basedOn w:val="VerbatimChar"/>
     <w:rPr>
@@ -7942,7 +9204,7 @@
       <w:sz w:val="22"/>
     </w:rPr>
   </w:style>
-  <w:style w:type="character" w:customStyle="1" w:styleId="StringTok">
+  <w:style w:type="character" w:styleId="StringTok" w:customStyle="1">
     <w:name w:val="StringTok"/>
     <w:basedOn w:val="VerbatimChar"/>
     <w:rPr>
@@ -7951,7 +9213,7 @@
       <w:sz w:val="22"/>
     </w:rPr>
   </w:style>
-  <w:style w:type="character" w:customStyle="1" w:styleId="VerbatimStringTok">
+  <w:style w:type="character" w:styleId="VerbatimStringTok" w:customStyle="1">
     <w:name w:val="VerbatimStringTok"/>
     <w:basedOn w:val="VerbatimChar"/>
     <w:rPr>
@@ -7960,7 +9222,7 @@
       <w:sz w:val="22"/>
     </w:rPr>
   </w:style>
-  <w:style w:type="character" w:customStyle="1" w:styleId="SpecialStringTok">
+  <w:style w:type="character" w:styleId="SpecialStringTok" w:customStyle="1">
     <w:name w:val="SpecialStringTok"/>
     <w:basedOn w:val="VerbatimChar"/>
     <w:rPr>
@@ -7969,7 +9231,7 @@
       <w:sz w:val="22"/>
     </w:rPr>
   </w:style>
-  <w:style w:type="character" w:customStyle="1" w:styleId="ImportTok">
+  <w:style w:type="character" w:styleId="ImportTok" w:customStyle="1">
     <w:name w:val="ImportTok"/>
     <w:basedOn w:val="VerbatimChar"/>
     <w:rPr>
@@ -7979,7 +9241,7 @@
       <w:sz w:val="22"/>
     </w:rPr>
   </w:style>
-  <w:style w:type="character" w:customStyle="1" w:styleId="CommentTok">
+  <w:style w:type="character" w:styleId="CommentTok" w:customStyle="1">
     <w:name w:val="CommentTok"/>
     <w:basedOn w:val="VerbatimChar"/>
     <w:rPr>
@@ -7989,7 +9251,7 @@
       <w:sz w:val="22"/>
     </w:rPr>
   </w:style>
-  <w:style w:type="character" w:customStyle="1" w:styleId="DocumentationTok">
+  <w:style w:type="character" w:styleId="DocumentationTok" w:customStyle="1">
     <w:name w:val="DocumentationTok"/>
     <w:basedOn w:val="VerbatimChar"/>
     <w:rPr>
@@ -7999,7 +9261,7 @@
       <w:sz w:val="22"/>
     </w:rPr>
   </w:style>
-  <w:style w:type="character" w:customStyle="1" w:styleId="AnnotationTok">
+  <w:style w:type="character" w:styleId="AnnotationTok" w:customStyle="1">
     <w:name w:val="AnnotationTok"/>
     <w:basedOn w:val="VerbatimChar"/>
     <w:rPr>
@@ -8010,7 +9272,7 @@
       <w:sz w:val="22"/>
     </w:rPr>
   </w:style>
-  <w:style w:type="character" w:customStyle="1" w:styleId="CommentVarTok">
+  <w:style w:type="character" w:styleId="CommentVarTok" w:customStyle="1">
     <w:name w:val="CommentVarTok"/>
     <w:basedOn w:val="VerbatimChar"/>
     <w:rPr>
@@ -8021,7 +9283,7 @@
       <w:sz w:val="22"/>
     </w:rPr>
   </w:style>
-  <w:style w:type="character" w:customStyle="1" w:styleId="OtherTok">
+  <w:style w:type="character" w:styleId="OtherTok" w:customStyle="1">
     <w:name w:val="OtherTok"/>
     <w:basedOn w:val="VerbatimChar"/>
     <w:rPr>
@@ -8030,7 +9292,7 @@
       <w:sz w:val="22"/>
     </w:rPr>
   </w:style>
-  <w:style w:type="character" w:customStyle="1" w:styleId="FunctionTok">
+  <w:style w:type="character" w:styleId="FunctionTok" w:customStyle="1">
     <w:name w:val="FunctionTok"/>
     <w:basedOn w:val="VerbatimChar"/>
     <w:rPr>
@@ -8039,7 +9301,7 @@
       <w:sz w:val="22"/>
     </w:rPr>
   </w:style>
-  <w:style w:type="character" w:customStyle="1" w:styleId="VariableTok">
+  <w:style w:type="character" w:styleId="VariableTok" w:customStyle="1">
     <w:name w:val="VariableTok"/>
     <w:basedOn w:val="VerbatimChar"/>
     <w:rPr>
@@ -8048,7 +9310,7 @@
       <w:sz w:val="22"/>
     </w:rPr>
   </w:style>
-  <w:style w:type="character" w:customStyle="1" w:styleId="ControlFlowTok">
+  <w:style w:type="character" w:styleId="ControlFlowTok" w:customStyle="1">
     <w:name w:val="ControlFlowTok"/>
     <w:basedOn w:val="VerbatimChar"/>
     <w:rPr>
@@ -8058,7 +9320,7 @@
       <w:sz w:val="22"/>
     </w:rPr>
   </w:style>
-  <w:style w:type="character" w:customStyle="1" w:styleId="OperatorTok">
+  <w:style w:type="character" w:styleId="OperatorTok" w:customStyle="1">
     <w:name w:val="OperatorTok"/>
     <w:basedOn w:val="VerbatimChar"/>
     <w:rPr>
@@ -8067,7 +9329,7 @@
       <w:sz w:val="22"/>
     </w:rPr>
   </w:style>
-  <w:style w:type="character" w:customStyle="1" w:styleId="BuiltInTok">
+  <w:style w:type="character" w:styleId="BuiltInTok" w:customStyle="1">
     <w:name w:val="BuiltInTok"/>
     <w:basedOn w:val="VerbatimChar"/>
     <w:rPr>
@@ -8076,7 +9338,7 @@
       <w:sz w:val="22"/>
     </w:rPr>
   </w:style>
-  <w:style w:type="character" w:customStyle="1" w:styleId="ExtensionTok">
+  <w:style w:type="character" w:styleId="ExtensionTok" w:customStyle="1">
     <w:name w:val="ExtensionTok"/>
     <w:basedOn w:val="VerbatimChar"/>
     <w:rPr>
@@ -8084,7 +9346,7 @@
       <w:sz w:val="22"/>
     </w:rPr>
   </w:style>
-  <w:style w:type="character" w:customStyle="1" w:styleId="PreprocessorTok">
+  <w:style w:type="character" w:styleId="PreprocessorTok" w:customStyle="1">
     <w:name w:val="PreprocessorTok"/>
     <w:basedOn w:val="VerbatimChar"/>
     <w:rPr>
@@ -8093,7 +9355,7 @@
       <w:sz w:val="22"/>
     </w:rPr>
   </w:style>
-  <w:style w:type="character" w:customStyle="1" w:styleId="AttributeTok">
+  <w:style w:type="character" w:styleId="AttributeTok" w:customStyle="1">
     <w:name w:val="AttributeTok"/>
     <w:basedOn w:val="VerbatimChar"/>
     <w:rPr>
@@ -8102,7 +9364,7 @@
       <w:sz w:val="22"/>
     </w:rPr>
   </w:style>
-  <w:style w:type="character" w:customStyle="1" w:styleId="RegionMarkerTok">
+  <w:style w:type="character" w:styleId="RegionMarkerTok" w:customStyle="1">
     <w:name w:val="RegionMarkerTok"/>
     <w:basedOn w:val="VerbatimChar"/>
     <w:rPr>
@@ -8110,7 +9372,7 @@
       <w:sz w:val="22"/>
     </w:rPr>
   </w:style>
-  <w:style w:type="character" w:customStyle="1" w:styleId="InformationTok">
+  <w:style w:type="character" w:styleId="InformationTok" w:customStyle="1">
     <w:name w:val="InformationTok"/>
     <w:basedOn w:val="VerbatimChar"/>
     <w:rPr>
@@ -8121,7 +9383,7 @@
       <w:sz w:val="22"/>
     </w:rPr>
   </w:style>
-  <w:style w:type="character" w:customStyle="1" w:styleId="WarningTok">
+  <w:style w:type="character" w:styleId="WarningTok" w:customStyle="1">
     <w:name w:val="WarningTok"/>
     <w:basedOn w:val="VerbatimChar"/>
     <w:rPr>
@@ -8132,7 +9394,7 @@
       <w:sz w:val="22"/>
     </w:rPr>
   </w:style>
-  <w:style w:type="character" w:customStyle="1" w:styleId="AlertTok">
+  <w:style w:type="character" w:styleId="AlertTok" w:customStyle="1">
     <w:name w:val="AlertTok"/>
     <w:basedOn w:val="VerbatimChar"/>
     <w:rPr>
@@ -8142,7 +9404,7 @@
       <w:sz w:val="22"/>
     </w:rPr>
   </w:style>
-  <w:style w:type="character" w:customStyle="1" w:styleId="ErrorTok">
+  <w:style w:type="character" w:styleId="ErrorTok" w:customStyle="1">
     <w:name w:val="ErrorTok"/>
     <w:basedOn w:val="VerbatimChar"/>
     <w:rPr>
@@ -8152,7 +9414,7 @@
       <w:sz w:val="22"/>
     </w:rPr>
   </w:style>
-  <w:style w:type="character" w:customStyle="1" w:styleId="NormalTok">
+  <w:style w:type="character" w:styleId="NormalTok" w:customStyle="1">
     <w:name w:val="NormalTok"/>
     <w:basedOn w:val="VerbatimChar"/>
     <w:rPr>
@@ -8173,7 +9435,7 @@
       <w:spacing w:after="0"/>
     </w:pPr>
   </w:style>
-  <w:style w:type="character" w:customStyle="1" w:styleId="HeaderChar">
+  <w:style w:type="character" w:styleId="HeaderChar" w:customStyle="1">
     <w:name w:val="Header Char"/>
     <w:basedOn w:val="DefaultParagraphFont"/>
     <w:link w:val="Header"/>
@@ -8192,7 +9454,7 @@
       <w:spacing w:after="0"/>
     </w:pPr>
   </w:style>
-  <w:style w:type="character" w:customStyle="1" w:styleId="FooterChar">
+  <w:style w:type="character" w:styleId="FooterChar" w:customStyle="1">
     <w:name w:val="Footer Char"/>
     <w:basedOn w:val="DefaultParagraphFont"/>
     <w:link w:val="Footer"/>

</xml_diff>